<commit_message>
Livrable : correction du tableau des 5 dimensions
Co-Authored-By: Claude Opus 5.5 <noreply@anthropic.com>
Claude-Session: https://claude.ai/code/session_01GhVoXRgaJJbfXgbund27Nd
</commit_message>
<xml_diff>
--- a/livrables/Livrable_Marketing_Strategique_sip_lab_luna.docx
+++ b/livrables/Livrable_Marketing_Strategique_sip_lab_luna.docx
@@ -1193,6 +1193,24 @@
               <w:t xml:space="preserve">Encapsulation de vitamines, minéraux, extraits de plantes</w:t>
             </w:r>
           </w:p>
+        </w:tc>
+        <w:tc>
+          <w:tcPr>
+            <w:tcW w:type="dxa" w:w="1928"/>
+            <w:tcBorders>
+              <w:top w:val="single" w:color="E3D6DA" w:sz="4"/>
+              <w:left w:val="single" w:color="E3D6DA" w:sz="4"/>
+              <w:bottom w:val="single" w:color="E3D6DA" w:sz="4"/>
+              <w:right w:val="single" w:color="E3D6DA" w:sz="4"/>
+            </w:tcBorders>
+            <w:tcMar>
+              <w:top w:type="dxa" w:w="70"/>
+              <w:left w:type="dxa" w:w="100"/>
+              <w:bottom w:type="dxa" w:w="70"/>
+              <w:right w:type="dxa" w:w="100"/>
+            </w:tcMar>
+            <w:vAlign w:val="top"/>
+          </w:tcPr>
           <w:p>
             <w:pPr>
               <w:spacing w:after="40" w:line="252"/>
@@ -1207,7 +1225,7 @@
                 <w:sz w:val="16"/>
                 <w:szCs w:val="16"/>
               </w:rPr>
-              <w:t xml:space="preserve">Dose unitaire par paille</w:t>
+              <w:t xml:space="preserve">Apporter une dose d'actifs sans rien avaler</w:t>
             </w:r>
           </w:p>
           <w:p>
@@ -1224,27 +1242,9 @@
                 <w:sz w:val="16"/>
                 <w:szCs w:val="16"/>
               </w:rPr>
-              <w:t xml:space="preserve">Sachet individuel daté, étui de 7 pailles</w:t>
-            </w:r>
-          </w:p>
-        </w:tc>
-        <w:tc>
-          <w:tcPr>
-            <w:tcW w:type="dxa" w:w="1928"/>
-            <w:tcBorders>
-              <w:top w:val="single" w:color="E3D6DA" w:sz="4"/>
-              <w:left w:val="single" w:color="E3D6DA" w:sz="4"/>
-              <w:bottom w:val="single" w:color="E3D6DA" w:sz="4"/>
-              <w:right w:val="single" w:color="E3D6DA" w:sz="4"/>
-            </w:tcBorders>
-            <w:tcMar>
-              <w:top w:type="dxa" w:w="70"/>
-              <w:left w:type="dxa" w:w="100"/>
-              <w:bottom w:type="dxa" w:w="70"/>
-              <w:right w:type="dxa" w:w="100"/>
-            </w:tcMar>
-            <w:vAlign w:val="top"/>
-          </w:tcPr>
+              <w:t xml:space="preserve">Doser précisément, sans mesurer (1 paille = 1 dose)</w:t>
+            </w:r>
+          </w:p>
           <w:p>
             <w:pPr>
               <w:spacing w:after="40" w:line="252"/>
@@ -1259,7 +1259,7 @@
                 <w:sz w:val="16"/>
                 <w:szCs w:val="16"/>
               </w:rPr>
-              <w:t xml:space="preserve">Apporter une dose d'actifs sans rien avaler</w:t>
+              <w:t xml:space="preserve">Masquer le goût (arômes naturels, sans sucre ajouté)</w:t>
             </w:r>
           </w:p>
           <w:p>
@@ -1276,7 +1276,7 @@
                 <w:sz w:val="16"/>
                 <w:szCs w:val="16"/>
               </w:rPr>
-              <w:t xml:space="preserve">Masquer le goût (arômes naturels, sans sucre ajouté)</w:t>
+              <w:t xml:space="preserve">Rendre la dose visible</w:t>
             </w:r>
           </w:p>
           <w:p>
@@ -1293,7 +1293,7 @@
                 <w:sz w:val="16"/>
                 <w:szCs w:val="16"/>
               </w:rPr>
-              <w:t xml:space="preserve">Rendre la dose visible</w:t>
+              <w:t xml:space="preserve">Rendre la prise régulière (1 paille = 1 jour)</w:t>
             </w:r>
           </w:p>
           <w:p>
@@ -1310,9 +1310,27 @@
                 <w:sz w:val="16"/>
                 <w:szCs w:val="16"/>
               </w:rPr>
-              <w:t xml:space="preserve">Rendre la prise régulière (1 paille = 1 jour)</w:t>
-            </w:r>
-          </w:p>
+              <w:t xml:space="preserve">Faire boire un verre à chaque prise</w:t>
+            </w:r>
+          </w:p>
+        </w:tc>
+        <w:tc>
+          <w:tcPr>
+            <w:tcW w:type="dxa" w:w="1928"/>
+            <w:tcBorders>
+              <w:top w:val="single" w:color="E3D6DA" w:sz="4"/>
+              <w:left w:val="single" w:color="E3D6DA" w:sz="4"/>
+              <w:bottom w:val="single" w:color="E3D6DA" w:sz="4"/>
+              <w:right w:val="single" w:color="E3D6DA" w:sz="4"/>
+            </w:tcBorders>
+            <w:tcMar>
+              <w:top w:type="dxa" w:w="70"/>
+              <w:left w:type="dxa" w:w="100"/>
+              <w:bottom w:type="dxa" w:w="70"/>
+              <w:right w:type="dxa" w:w="100"/>
+            </w:tcMar>
+            <w:vAlign w:val="top"/>
+          </w:tcPr>
           <w:p>
             <w:pPr>
               <w:spacing w:after="40" w:line="252"/>
@@ -1327,27 +1345,9 @@
                 <w:sz w:val="16"/>
                 <w:szCs w:val="16"/>
               </w:rPr>
-              <w:t xml:space="preserve">Faire boire un verre à chaque prise</w:t>
-            </w:r>
-          </w:p>
-        </w:tc>
-        <w:tc>
-          <w:tcPr>
-            <w:tcW w:type="dxa" w:w="1928"/>
-            <w:tcBorders>
-              <w:top w:val="single" w:color="E3D6DA" w:sz="4"/>
-              <w:left w:val="single" w:color="E3D6DA" w:sz="4"/>
-              <w:bottom w:val="single" w:color="E3D6DA" w:sz="4"/>
-              <w:right w:val="single" w:color="E3D6DA" w:sz="4"/>
-            </w:tcBorders>
-            <w:tcMar>
-              <w:top w:type="dxa" w:w="70"/>
-              <w:left w:type="dxa" w:w="100"/>
-              <w:bottom w:type="dxa" w:w="70"/>
-              <w:right w:type="dxa" w:w="100"/>
-            </w:tcMar>
-            <w:vAlign w:val="top"/>
-          </w:tcPr>
+              <w:t xml:space="preserve">Énergie et concentration</w:t>
+            </w:r>
+          </w:p>
           <w:p>
             <w:pPr>
               <w:spacing w:after="40" w:line="252"/>
@@ -1362,7 +1362,7 @@
                 <w:sz w:val="16"/>
                 <w:szCs w:val="16"/>
               </w:rPr>
-              <w:t xml:space="preserve">Énergie et concentration</w:t>
+              <w:t xml:space="preserve">Beauté de l'intérieur</w:t>
             </w:r>
           </w:p>
           <w:p>
@@ -1379,7 +1379,7 @@
                 <w:sz w:val="16"/>
                 <w:szCs w:val="16"/>
               </w:rPr>
-              <w:t xml:space="preserve">Beauté de l'intérieur</w:t>
+              <w:t xml:space="preserve">Sommeil et stress</w:t>
             </w:r>
           </w:p>
           <w:p>
@@ -1396,7 +1396,7 @@
                 <w:sz w:val="16"/>
                 <w:szCs w:val="16"/>
               </w:rPr>
-              <w:t xml:space="preserve">Sommeil et stress</w:t>
+              <w:t xml:space="preserve">Santé hormonale : cycle, grossesse, ménopause</w:t>
             </w:r>
           </w:p>
           <w:p>
@@ -1413,9 +1413,27 @@
                 <w:sz w:val="16"/>
                 <w:szCs w:val="16"/>
               </w:rPr>
-              <w:t xml:space="preserve">Santé hormonale : cycle, grossesse, ménopause</w:t>
-            </w:r>
-          </w:p>
+              <w:t xml:space="preserve">Os, mobilité, hydratation</w:t>
+            </w:r>
+          </w:p>
+        </w:tc>
+        <w:tc>
+          <w:tcPr>
+            <w:tcW w:type="dxa" w:w="1928"/>
+            <w:tcBorders>
+              <w:top w:val="single" w:color="E3D6DA" w:sz="4"/>
+              <w:left w:val="single" w:color="E3D6DA" w:sz="4"/>
+              <w:bottom w:val="single" w:color="E3D6DA" w:sz="4"/>
+              <w:right w:val="single" w:color="E3D6DA" w:sz="4"/>
+            </w:tcBorders>
+            <w:tcMar>
+              <w:top w:type="dxa" w:w="70"/>
+              <w:left w:type="dxa" w:w="100"/>
+              <w:bottom w:type="dxa" w:w="70"/>
+              <w:right w:type="dxa" w:w="100"/>
+            </w:tcMar>
+            <w:vAlign w:val="top"/>
+          </w:tcPr>
           <w:p>
             <w:pPr>
               <w:spacing w:after="40" w:line="252"/>
@@ -1430,27 +1448,9 @@
                 <w:sz w:val="16"/>
                 <w:szCs w:val="16"/>
               </w:rPr>
-              <w:t xml:space="preserve">Os, mobilité, hydratation</w:t>
-            </w:r>
-          </w:p>
-        </w:tc>
-        <w:tc>
-          <w:tcPr>
-            <w:tcW w:type="dxa" w:w="1928"/>
-            <w:tcBorders>
-              <w:top w:val="single" w:color="E3D6DA" w:sz="4"/>
-              <w:left w:val="single" w:color="E3D6DA" w:sz="4"/>
-              <w:bottom w:val="single" w:color="E3D6DA" w:sz="4"/>
-              <w:right w:val="single" w:color="E3D6DA" w:sz="4"/>
-            </w:tcBorders>
-            <w:tcMar>
-              <w:top w:type="dxa" w:w="70"/>
-              <w:left w:type="dxa" w:w="100"/>
-              <w:bottom w:type="dxa" w:w="70"/>
-              <w:right w:type="dxa" w:w="100"/>
-            </w:tcMar>
-            <w:vAlign w:val="top"/>
-          </w:tcPr>
+              <w:t xml:space="preserve">Enfants 4-11 ans (achat des parents)</w:t>
+            </w:r>
+          </w:p>
           <w:p>
             <w:pPr>
               <w:spacing w:after="40" w:line="252"/>
@@ -1465,7 +1465,7 @@
                 <w:sz w:val="16"/>
                 <w:szCs w:val="16"/>
               </w:rPr>
-              <w:t xml:space="preserve">Enfants 4-11 ans (achat des parents)</w:t>
+              <w:t xml:space="preserve">Femmes actives 20-45 ans</w:t>
             </w:r>
           </w:p>
           <w:p>
@@ -1482,7 +1482,7 @@
                 <w:sz w:val="16"/>
                 <w:szCs w:val="16"/>
               </w:rPr>
-              <w:t xml:space="preserve">Femmes actives 20-45 ans</w:t>
+              <w:t xml:space="preserve">Femmes 45-60 ans</w:t>
             </w:r>
           </w:p>
           <w:p>
@@ -1499,7 +1499,7 @@
                 <w:sz w:val="16"/>
                 <w:szCs w:val="16"/>
               </w:rPr>
-              <w:t xml:space="preserve">Femmes 45-60 ans</w:t>
+              <w:t xml:space="preserve">Seniors 65 ans et +</w:t>
             </w:r>
           </w:p>
           <w:p>
@@ -1516,9 +1516,27 @@
                 <w:sz w:val="16"/>
                 <w:szCs w:val="16"/>
               </w:rPr>
-              <w:t xml:space="preserve">Seniors 65 ans et +</w:t>
-            </w:r>
-          </w:p>
+              <w:t xml:space="preserve">Sportifs amateurs</w:t>
+            </w:r>
+          </w:p>
+        </w:tc>
+        <w:tc>
+          <w:tcPr>
+            <w:tcW w:type="dxa" w:w="1926"/>
+            <w:tcBorders>
+              <w:top w:val="single" w:color="E3D6DA" w:sz="4"/>
+              <w:left w:val="single" w:color="E3D6DA" w:sz="4"/>
+              <w:bottom w:val="single" w:color="E3D6DA" w:sz="4"/>
+              <w:right w:val="single" w:color="E3D6DA" w:sz="4"/>
+            </w:tcBorders>
+            <w:tcMar>
+              <w:top w:type="dxa" w:w="70"/>
+              <w:left w:type="dxa" w:w="100"/>
+              <w:bottom w:type="dxa" w:w="70"/>
+              <w:right w:type="dxa" w:w="100"/>
+            </w:tcMar>
+            <w:vAlign w:val="top"/>
+          </w:tcPr>
           <w:p>
             <w:pPr>
               <w:spacing w:after="40" w:line="252"/>
@@ -1533,42 +1551,7 @@
                 <w:sz w:val="16"/>
                 <w:szCs w:val="16"/>
               </w:rPr>
-              <w:t xml:space="preserve">Sportifs amateurs</w:t>
-            </w:r>
-          </w:p>
-        </w:tc>
-        <w:tc>
-          <w:tcPr>
-            <w:tcW w:type="dxa" w:w="1926"/>
-            <w:tcBorders>
-              <w:top w:val="single" w:color="E3D6DA" w:sz="4"/>
-              <w:left w:val="single" w:color="E3D6DA" w:sz="4"/>
-              <w:bottom w:val="single" w:color="E3D6DA" w:sz="4"/>
-              <w:right w:val="single" w:color="E3D6DA" w:sz="4"/>
-            </w:tcBorders>
-            <w:tcMar>
-              <w:top w:type="dxa" w:w="70"/>
-              <w:left w:type="dxa" w:w="100"/>
-              <w:bottom w:type="dxa" w:w="70"/>
-              <w:right w:type="dxa" w:w="100"/>
-            </w:tcMar>
-            <w:vAlign w:val="top"/>
-          </w:tcPr>
-          <w:p>
-            <w:pPr>
-              <w:spacing w:after="40" w:line="252"/>
-              <w:jc w:val="left"/>
-            </w:pPr>
-            <w:r>
-              <w:rPr>
-                <w:rFonts w:ascii="Calibri" w:cs="Calibri" w:eastAsia="Calibri" w:hAnsi="Calibri"/>
-                <w:b w:val="false"/>
-                <w:bCs w:val="false"/>
-                <w:color w:val="2A1A20"/>
-                <w:sz w:val="16"/>
-                <w:szCs w:val="16"/>
-              </w:rPr>
-              <w:t xml:space="preserve">Étui semaine (7 pailles)</w:t>
+              <w:t xml:space="preserve">Étui semaine de 7 pailles en sachets individuels datés</w:t>
             </w:r>
           </w:p>
           <w:p>

</xml_diff>

<commit_message>
Livrable : notation pondérée des DAS (partie 4)
Co-Authored-By: Claude Opus 5.5 <noreply@anthropic.com>
Claude-Session: https://claude.ai/code/session_01GhVoXRgaJJbfXgbund27Nd
</commit_message>
<xml_diff>
--- a/livrables/Livrable_Marketing_Strategique_sip_lab_luna.docx
+++ b/livrables/Livrable_Marketing_Strategique_sip_lab_luna.docx
@@ -3359,13 +3359,13 @@
         <w:tblLayout w:type="fixed"/>
       </w:tblPr>
       <w:tblGrid>
+        <w:gridCol w:w="1157"/>
+        <w:gridCol w:w="2313"/>
+        <w:gridCol w:w="1157"/>
+        <w:gridCol w:w="1060"/>
         <w:gridCol w:w="1253"/>
-        <w:gridCol w:w="2313"/>
-        <w:gridCol w:w="1253"/>
+        <w:gridCol w:w="1831"/>
         <w:gridCol w:w="867"/>
-        <w:gridCol w:w="1253"/>
-        <w:gridCol w:w="1928"/>
-        <w:gridCol w:w="771"/>
       </w:tblGrid>
       <w:tr>
         <w:trPr>
@@ -3373,7 +3373,7 @@
         </w:trPr>
         <w:tc>
           <w:tcPr>
-            <w:tcW w:type="dxa" w:w="1253"/>
+            <w:tcW w:type="dxa" w:w="1157"/>
             <w:tcBorders>
               <w:top w:val="single" w:color="E3D6DA" w:sz="4"/>
               <w:left w:val="single" w:color="E3D6DA" w:sz="4"/>
@@ -3445,7 +3445,7 @@
         </w:tc>
         <w:tc>
           <w:tcPr>
-            <w:tcW w:type="dxa" w:w="1253"/>
+            <w:tcW w:type="dxa" w:w="1157"/>
             <w:tcBorders>
               <w:top w:val="single" w:color="E3D6DA" w:sz="4"/>
               <w:left w:val="single" w:color="E3D6DA" w:sz="4"/>
@@ -3481,7 +3481,7 @@
         </w:tc>
         <w:tc>
           <w:tcPr>
-            <w:tcW w:type="dxa" w:w="867"/>
+            <w:tcW w:type="dxa" w:w="1060"/>
             <w:tcBorders>
               <w:top w:val="single" w:color="E3D6DA" w:sz="4"/>
               <w:left w:val="single" w:color="E3D6DA" w:sz="4"/>
@@ -3553,7 +3553,7 @@
         </w:tc>
         <w:tc>
           <w:tcPr>
-            <w:tcW w:type="dxa" w:w="1928"/>
+            <w:tcW w:type="dxa" w:w="1831"/>
             <w:tcBorders>
               <w:top w:val="single" w:color="E3D6DA" w:sz="4"/>
               <w:left w:val="single" w:color="E3D6DA" w:sz="4"/>
@@ -3589,7 +3589,7 @@
         </w:tc>
         <w:tc>
           <w:tcPr>
-            <w:tcW w:type="dxa" w:w="771"/>
+            <w:tcW w:type="dxa" w:w="867"/>
             <w:tcBorders>
               <w:top w:val="single" w:color="E3D6DA" w:sz="4"/>
               <w:left w:val="single" w:color="E3D6DA" w:sz="4"/>
@@ -3627,7 +3627,7 @@
       <w:tr>
         <w:tc>
           <w:tcPr>
-            <w:tcW w:type="dxa" w:w="1253"/>
+            <w:tcW w:type="dxa" w:w="1157"/>
             <w:tcBorders>
               <w:top w:val="single" w:color="E3D6DA" w:sz="4"/>
               <w:left w:val="single" w:color="E3D6DA" w:sz="4"/>
@@ -3715,7 +3715,7 @@
         </w:tc>
         <w:tc>
           <w:tcPr>
-            <w:tcW w:type="dxa" w:w="1253"/>
+            <w:tcW w:type="dxa" w:w="1157"/>
             <w:tcBorders>
               <w:top w:val="single" w:color="E3D6DA" w:sz="4"/>
               <w:left w:val="single" w:color="E3D6DA" w:sz="4"/>
@@ -3750,7 +3750,7 @@
         </w:tc>
         <w:tc>
           <w:tcPr>
-            <w:tcW w:type="dxa" w:w="867"/>
+            <w:tcW w:type="dxa" w:w="1060"/>
             <w:tcBorders>
               <w:top w:val="single" w:color="E3D6DA" w:sz="4"/>
               <w:left w:val="single" w:color="E3D6DA" w:sz="4"/>
@@ -3779,7 +3779,7 @@
                 <w:sz w:val="15"/>
                 <w:szCs w:val="15"/>
               </w:rPr>
-              <w:t xml:space="preserve">MOYENNE</w:t>
+              <w:t xml:space="preserve">MOYENNE (3,10)</w:t>
             </w:r>
           </w:p>
         </w:tc>
@@ -3820,7 +3820,7 @@
         </w:tc>
         <w:tc>
           <w:tcPr>
-            <w:tcW w:type="dxa" w:w="1928"/>
+            <w:tcW w:type="dxa" w:w="1831"/>
             <w:tcBorders>
               <w:top w:val="single" w:color="E3D6DA" w:sz="4"/>
               <w:left w:val="single" w:color="E3D6DA" w:sz="4"/>
@@ -3872,7 +3872,7 @@
         </w:tc>
         <w:tc>
           <w:tcPr>
-            <w:tcW w:type="dxa" w:w="771"/>
+            <w:tcW w:type="dxa" w:w="867"/>
             <w:tcBorders>
               <w:top w:val="single" w:color="E3D6DA" w:sz="4"/>
               <w:left w:val="single" w:color="E3D6DA" w:sz="4"/>
@@ -3901,7 +3901,7 @@
                 <w:sz w:val="15"/>
                 <w:szCs w:val="15"/>
               </w:rPr>
-              <w:t xml:space="preserve">FORT</w:t>
+              <w:t xml:space="preserve">FORT (4,10)</w:t>
             </w:r>
           </w:p>
         </w:tc>
@@ -3909,7 +3909,7 @@
       <w:tr>
         <w:tc>
           <w:tcPr>
-            <w:tcW w:type="dxa" w:w="1253"/>
+            <w:tcW w:type="dxa" w:w="1157"/>
             <w:tcBorders>
               <w:top w:val="single" w:color="E3D6DA" w:sz="4"/>
               <w:left w:val="single" w:color="E3D6DA" w:sz="4"/>
@@ -3994,7 +3994,7 @@
         </w:tc>
         <w:tc>
           <w:tcPr>
-            <w:tcW w:type="dxa" w:w="1253"/>
+            <w:tcW w:type="dxa" w:w="1157"/>
             <w:tcBorders>
               <w:top w:val="single" w:color="E3D6DA" w:sz="4"/>
               <w:left w:val="single" w:color="E3D6DA" w:sz="4"/>
@@ -4028,7 +4028,7 @@
         </w:tc>
         <w:tc>
           <w:tcPr>
-            <w:tcW w:type="dxa" w:w="867"/>
+            <w:tcW w:type="dxa" w:w="1060"/>
             <w:tcBorders>
               <w:top w:val="single" w:color="E3D6DA" w:sz="4"/>
               <w:left w:val="single" w:color="E3D6DA" w:sz="4"/>
@@ -4056,7 +4056,7 @@
                 <w:sz w:val="15"/>
                 <w:szCs w:val="15"/>
               </w:rPr>
-              <w:t xml:space="preserve">FORTE</w:t>
+              <w:t xml:space="preserve">FORTE (4,05)</w:t>
             </w:r>
           </w:p>
         </w:tc>
@@ -4096,7 +4096,7 @@
         </w:tc>
         <w:tc>
           <w:tcPr>
-            <w:tcW w:type="dxa" w:w="1928"/>
+            <w:tcW w:type="dxa" w:w="1831"/>
             <w:tcBorders>
               <w:top w:val="single" w:color="E3D6DA" w:sz="4"/>
               <w:left w:val="single" w:color="E3D6DA" w:sz="4"/>
@@ -4145,7 +4145,7 @@
         </w:tc>
         <w:tc>
           <w:tcPr>
-            <w:tcW w:type="dxa" w:w="771"/>
+            <w:tcW w:type="dxa" w:w="867"/>
             <w:tcBorders>
               <w:top w:val="single" w:color="E3D6DA" w:sz="4"/>
               <w:left w:val="single" w:color="E3D6DA" w:sz="4"/>
@@ -4173,7 +4173,7 @@
                 <w:sz w:val="15"/>
                 <w:szCs w:val="15"/>
               </w:rPr>
-              <w:t xml:space="preserve">MOYEN à FORT</w:t>
+              <w:t xml:space="preserve">MOYEN+ (3,60)</w:t>
             </w:r>
           </w:p>
         </w:tc>
@@ -4181,7 +4181,7 @@
       <w:tr>
         <w:tc>
           <w:tcPr>
-            <w:tcW w:type="dxa" w:w="1253"/>
+            <w:tcW w:type="dxa" w:w="1157"/>
             <w:tcBorders>
               <w:top w:val="single" w:color="E3D6DA" w:sz="4"/>
               <w:left w:val="single" w:color="E3D6DA" w:sz="4"/>
@@ -4269,7 +4269,7 @@
         </w:tc>
         <w:tc>
           <w:tcPr>
-            <w:tcW w:type="dxa" w:w="1253"/>
+            <w:tcW w:type="dxa" w:w="1157"/>
             <w:tcBorders>
               <w:top w:val="single" w:color="E3D6DA" w:sz="4"/>
               <w:left w:val="single" w:color="E3D6DA" w:sz="4"/>
@@ -4304,7 +4304,7 @@
         </w:tc>
         <w:tc>
           <w:tcPr>
-            <w:tcW w:type="dxa" w:w="867"/>
+            <w:tcW w:type="dxa" w:w="1060"/>
             <w:tcBorders>
               <w:top w:val="single" w:color="E3D6DA" w:sz="4"/>
               <w:left w:val="single" w:color="E3D6DA" w:sz="4"/>
@@ -4333,7 +4333,7 @@
                 <w:sz w:val="15"/>
                 <w:szCs w:val="15"/>
               </w:rPr>
-              <w:t xml:space="preserve">MOYENNE</w:t>
+              <w:t xml:space="preserve">MOYENNE (3,05)</w:t>
             </w:r>
           </w:p>
         </w:tc>
@@ -4374,7 +4374,7 @@
         </w:tc>
         <w:tc>
           <w:tcPr>
-            <w:tcW w:type="dxa" w:w="1928"/>
+            <w:tcW w:type="dxa" w:w="1831"/>
             <w:tcBorders>
               <w:top w:val="single" w:color="E3D6DA" w:sz="4"/>
               <w:left w:val="single" w:color="E3D6DA" w:sz="4"/>
@@ -4426,7 +4426,7 @@
         </w:tc>
         <w:tc>
           <w:tcPr>
-            <w:tcW w:type="dxa" w:w="771"/>
+            <w:tcW w:type="dxa" w:w="867"/>
             <w:tcBorders>
               <w:top w:val="single" w:color="E3D6DA" w:sz="4"/>
               <w:left w:val="single" w:color="E3D6DA" w:sz="4"/>
@@ -4455,7 +4455,7 @@
                 <w:sz w:val="15"/>
                 <w:szCs w:val="15"/>
               </w:rPr>
-              <w:t xml:space="preserve">FAIBLE</w:t>
+              <w:t xml:space="preserve">FAIBLE (1,80)</w:t>
             </w:r>
           </w:p>
         </w:tc>
@@ -4463,7 +4463,7 @@
       <w:tr>
         <w:tc>
           <w:tcPr>
-            <w:tcW w:type="dxa" w:w="1253"/>
+            <w:tcW w:type="dxa" w:w="1157"/>
             <w:tcBorders>
               <w:top w:val="single" w:color="E3D6DA" w:sz="4"/>
               <w:left w:val="single" w:color="E3D6DA" w:sz="4"/>
@@ -4551,7 +4551,7 @@
         </w:tc>
         <w:tc>
           <w:tcPr>
-            <w:tcW w:type="dxa" w:w="1253"/>
+            <w:tcW w:type="dxa" w:w="1157"/>
             <w:tcBorders>
               <w:top w:val="single" w:color="E3D6DA" w:sz="4"/>
               <w:left w:val="single" w:color="E3D6DA" w:sz="4"/>
@@ -4586,7 +4586,7 @@
         </w:tc>
         <w:tc>
           <w:tcPr>
-            <w:tcW w:type="dxa" w:w="867"/>
+            <w:tcW w:type="dxa" w:w="1060"/>
             <w:tcBorders>
               <w:top w:val="single" w:color="E3D6DA" w:sz="4"/>
               <w:left w:val="single" w:color="E3D6DA" w:sz="4"/>
@@ -4615,7 +4615,7 @@
                 <w:sz w:val="15"/>
                 <w:szCs w:val="15"/>
               </w:rPr>
-              <w:t xml:space="preserve">MOYENNE</w:t>
+              <w:t xml:space="preserve">MOYENNE (3,55)</w:t>
             </w:r>
           </w:p>
         </w:tc>
@@ -4656,7 +4656,7 @@
         </w:tc>
         <w:tc>
           <w:tcPr>
-            <w:tcW w:type="dxa" w:w="1928"/>
+            <w:tcW w:type="dxa" w:w="1831"/>
             <w:tcBorders>
               <w:top w:val="single" w:color="E3D6DA" w:sz="4"/>
               <w:left w:val="single" w:color="E3D6DA" w:sz="4"/>
@@ -4708,7 +4708,7 @@
         </w:tc>
         <w:tc>
           <w:tcPr>
-            <w:tcW w:type="dxa" w:w="771"/>
+            <w:tcW w:type="dxa" w:w="867"/>
             <w:tcBorders>
               <w:top w:val="single" w:color="E3D6DA" w:sz="4"/>
               <w:left w:val="single" w:color="E3D6DA" w:sz="4"/>
@@ -4737,7 +4737,7 @@
                 <w:sz w:val="15"/>
                 <w:szCs w:val="15"/>
               </w:rPr>
-              <w:t xml:space="preserve">FAIBLE</w:t>
+              <w:t xml:space="preserve">FAIBLE (1,70)</w:t>
             </w:r>
           </w:p>
         </w:tc>
@@ -4747,6 +4747,2732 @@
       <w:pPr>
         <w:spacing w:after="80"/>
       </w:pPr>
+    </w:p>
+    <w:p>
+      <w:pPr>
+        <w:pStyle w:val="Heading2"/>
+        <w:spacing w:after="100" w:before="240"/>
+      </w:pPr>
+      <w:r>
+        <w:rPr>
+          <w:rFonts w:ascii="Cambria" w:cs="Cambria" w:eastAsia="Cambria" w:hAnsi="Cambria"/>
+          <w:color w:val="C8475A"/>
+          <w:sz w:val="25"/>
+          <w:szCs w:val="25"/>
+        </w:rPr>
+        <w:t xml:space="preserve">Notation pondérée (notes de 1 à 5)</w:t>
+      </w:r>
+    </w:p>
+    <w:tbl>
+      <w:tblPr>
+        <w:tblW w:type="dxa" w:w="9638"/>
+        <w:tblBorders>
+          <w:top w:val="single" w:color="auto" w:sz="4"/>
+          <w:left w:val="single" w:color="auto" w:sz="4"/>
+          <w:bottom w:val="single" w:color="auto" w:sz="4"/>
+          <w:right w:val="single" w:color="auto" w:sz="4"/>
+          <w:insideH w:val="single" w:color="auto" w:sz="4"/>
+          <w:insideV w:val="single" w:color="auto" w:sz="4"/>
+        </w:tblBorders>
+        <w:tblLayout w:type="fixed"/>
+      </w:tblPr>
+      <w:tblGrid>
+        <w:gridCol w:w="3855"/>
+        <w:gridCol w:w="964"/>
+        <w:gridCol w:w="1205"/>
+        <w:gridCol w:w="1205"/>
+        <w:gridCol w:w="1205"/>
+        <w:gridCol w:w="1204"/>
+      </w:tblGrid>
+      <w:tr>
+        <w:trPr>
+          <w:tblHeader/>
+        </w:trPr>
+        <w:tc>
+          <w:tcPr>
+            <w:tcW w:type="dxa" w:w="3855"/>
+            <w:tcBorders>
+              <w:top w:val="single" w:color="E3D6DA" w:sz="4"/>
+              <w:left w:val="single" w:color="E3D6DA" w:sz="4"/>
+              <w:bottom w:val="single" w:color="E3D6DA" w:sz="4"/>
+              <w:right w:val="single" w:color="E3D6DA" w:sz="4"/>
+            </w:tcBorders>
+            <w:shd w:fill="4A1626" w:color="auto" w:val="clear"/>
+            <w:tcMar>
+              <w:top w:type="dxa" w:w="70"/>
+              <w:left w:type="dxa" w:w="100"/>
+              <w:bottom w:type="dxa" w:w="70"/>
+              <w:right w:type="dxa" w:w="100"/>
+            </w:tcMar>
+            <w:vAlign w:val="top"/>
+          </w:tcPr>
+          <w:p>
+            <w:pPr>
+              <w:spacing w:after="40" w:line="252"/>
+              <w:jc w:val="left"/>
+            </w:pPr>
+            <w:r>
+              <w:rPr>
+                <w:rFonts w:ascii="Calibri" w:cs="Calibri" w:eastAsia="Calibri" w:hAnsi="Calibri"/>
+                <w:b/>
+                <w:bCs/>
+                <w:color w:val="FFFFFF"/>
+                <w:sz w:val="16"/>
+                <w:szCs w:val="16"/>
+              </w:rPr>
+              <w:t xml:space="preserve">Critère</w:t>
+            </w:r>
+          </w:p>
+        </w:tc>
+        <w:tc>
+          <w:tcPr>
+            <w:tcW w:type="dxa" w:w="964"/>
+            <w:tcBorders>
+              <w:top w:val="single" w:color="E3D6DA" w:sz="4"/>
+              <w:left w:val="single" w:color="E3D6DA" w:sz="4"/>
+              <w:bottom w:val="single" w:color="E3D6DA" w:sz="4"/>
+              <w:right w:val="single" w:color="E3D6DA" w:sz="4"/>
+            </w:tcBorders>
+            <w:shd w:fill="4A1626" w:color="auto" w:val="clear"/>
+            <w:tcMar>
+              <w:top w:type="dxa" w:w="70"/>
+              <w:left w:type="dxa" w:w="100"/>
+              <w:bottom w:type="dxa" w:w="70"/>
+              <w:right w:type="dxa" w:w="100"/>
+            </w:tcMar>
+            <w:vAlign w:val="top"/>
+          </w:tcPr>
+          <w:p>
+            <w:pPr>
+              <w:spacing w:after="40" w:line="252"/>
+              <w:jc w:val="left"/>
+            </w:pPr>
+            <w:r>
+              <w:rPr>
+                <w:rFonts w:ascii="Calibri" w:cs="Calibri" w:eastAsia="Calibri" w:hAnsi="Calibri"/>
+                <w:b/>
+                <w:bCs/>
+                <w:color w:val="FFFFFF"/>
+                <w:sz w:val="16"/>
+                <w:szCs w:val="16"/>
+              </w:rPr>
+              <w:t xml:space="preserve">Poids</w:t>
+            </w:r>
+          </w:p>
+        </w:tc>
+        <w:tc>
+          <w:tcPr>
+            <w:tcW w:type="dxa" w:w="1205"/>
+            <w:tcBorders>
+              <w:top w:val="single" w:color="E3D6DA" w:sz="4"/>
+              <w:left w:val="single" w:color="E3D6DA" w:sz="4"/>
+              <w:bottom w:val="single" w:color="E3D6DA" w:sz="4"/>
+              <w:right w:val="single" w:color="E3D6DA" w:sz="4"/>
+            </w:tcBorders>
+            <w:shd w:fill="4A1626" w:color="auto" w:val="clear"/>
+            <w:tcMar>
+              <w:top w:type="dxa" w:w="70"/>
+              <w:left w:type="dxa" w:w="100"/>
+              <w:bottom w:type="dxa" w:w="70"/>
+              <w:right w:type="dxa" w:w="100"/>
+            </w:tcMar>
+            <w:vAlign w:val="top"/>
+          </w:tcPr>
+          <w:p>
+            <w:pPr>
+              <w:spacing w:after="40" w:line="252"/>
+              <w:jc w:val="left"/>
+            </w:pPr>
+            <w:r>
+              <w:rPr>
+                <w:rFonts w:ascii="Calibri" w:cs="Calibri" w:eastAsia="Calibri" w:hAnsi="Calibri"/>
+                <w:b/>
+                <w:bCs/>
+                <w:color w:val="FFFFFF"/>
+                <w:sz w:val="16"/>
+                <w:szCs w:val="16"/>
+              </w:rPr>
+              <w:t xml:space="preserve">active</w:t>
+            </w:r>
+          </w:p>
+        </w:tc>
+        <w:tc>
+          <w:tcPr>
+            <w:tcW w:type="dxa" w:w="1205"/>
+            <w:tcBorders>
+              <w:top w:val="single" w:color="E3D6DA" w:sz="4"/>
+              <w:left w:val="single" w:color="E3D6DA" w:sz="4"/>
+              <w:bottom w:val="single" w:color="E3D6DA" w:sz="4"/>
+              <w:right w:val="single" w:color="E3D6DA" w:sz="4"/>
+            </w:tcBorders>
+            <w:shd w:fill="4A1626" w:color="auto" w:val="clear"/>
+            <w:tcMar>
+              <w:top w:type="dxa" w:w="70"/>
+              <w:left w:type="dxa" w:w="100"/>
+              <w:bottom w:type="dxa" w:w="70"/>
+              <w:right w:type="dxa" w:w="100"/>
+            </w:tcMar>
+            <w:vAlign w:val="top"/>
+          </w:tcPr>
+          <w:p>
+            <w:pPr>
+              <w:spacing w:after="40" w:line="252"/>
+              <w:jc w:val="left"/>
+            </w:pPr>
+            <w:r>
+              <w:rPr>
+                <w:rFonts w:ascii="Calibri" w:cs="Calibri" w:eastAsia="Calibri" w:hAnsi="Calibri"/>
+                <w:b/>
+                <w:bCs/>
+                <w:color w:val="FFFFFF"/>
+                <w:sz w:val="16"/>
+                <w:szCs w:val="16"/>
+              </w:rPr>
+              <w:t xml:space="preserve">luna</w:t>
+            </w:r>
+          </w:p>
+        </w:tc>
+        <w:tc>
+          <w:tcPr>
+            <w:tcW w:type="dxa" w:w="1205"/>
+            <w:tcBorders>
+              <w:top w:val="single" w:color="E3D6DA" w:sz="4"/>
+              <w:left w:val="single" w:color="E3D6DA" w:sz="4"/>
+              <w:bottom w:val="single" w:color="E3D6DA" w:sz="4"/>
+              <w:right w:val="single" w:color="E3D6DA" w:sz="4"/>
+            </w:tcBorders>
+            <w:shd w:fill="4A1626" w:color="auto" w:val="clear"/>
+            <w:tcMar>
+              <w:top w:type="dxa" w:w="70"/>
+              <w:left w:type="dxa" w:w="100"/>
+              <w:bottom w:type="dxa" w:w="70"/>
+              <w:right w:type="dxa" w:w="100"/>
+            </w:tcMar>
+            <w:vAlign w:val="top"/>
+          </w:tcPr>
+          <w:p>
+            <w:pPr>
+              <w:spacing w:after="40" w:line="252"/>
+              <w:jc w:val="left"/>
+            </w:pPr>
+            <w:r>
+              <w:rPr>
+                <w:rFonts w:ascii="Calibri" w:cs="Calibri" w:eastAsia="Calibri" w:hAnsi="Calibri"/>
+                <w:b/>
+                <w:bCs/>
+                <w:color w:val="FFFFFF"/>
+                <w:sz w:val="16"/>
+                <w:szCs w:val="16"/>
+              </w:rPr>
+              <w:t xml:space="preserve">mini</w:t>
+            </w:r>
+          </w:p>
+        </w:tc>
+        <w:tc>
+          <w:tcPr>
+            <w:tcW w:type="dxa" w:w="1204"/>
+            <w:tcBorders>
+              <w:top w:val="single" w:color="E3D6DA" w:sz="4"/>
+              <w:left w:val="single" w:color="E3D6DA" w:sz="4"/>
+              <w:bottom w:val="single" w:color="E3D6DA" w:sz="4"/>
+              <w:right w:val="single" w:color="E3D6DA" w:sz="4"/>
+            </w:tcBorders>
+            <w:shd w:fill="4A1626" w:color="auto" w:val="clear"/>
+            <w:tcMar>
+              <w:top w:type="dxa" w:w="70"/>
+              <w:left w:type="dxa" w:w="100"/>
+              <w:bottom w:type="dxa" w:w="70"/>
+              <w:right w:type="dxa" w:w="100"/>
+            </w:tcMar>
+            <w:vAlign w:val="top"/>
+          </w:tcPr>
+          <w:p>
+            <w:pPr>
+              <w:spacing w:after="40" w:line="252"/>
+              <w:jc w:val="left"/>
+            </w:pPr>
+            <w:r>
+              <w:rPr>
+                <w:rFonts w:ascii="Calibri" w:cs="Calibri" w:eastAsia="Calibri" w:hAnsi="Calibri"/>
+                <w:b/>
+                <w:bCs/>
+                <w:color w:val="FFFFFF"/>
+                <w:sz w:val="16"/>
+                <w:szCs w:val="16"/>
+              </w:rPr>
+              <w:t xml:space="preserve">silver</w:t>
+            </w:r>
+          </w:p>
+        </w:tc>
+      </w:tr>
+      <w:tr>
+        <w:tc>
+          <w:tcPr>
+            <w:tcW w:type="dxa" w:w="3855"/>
+            <w:tcBorders>
+              <w:top w:val="single" w:color="E3D6DA" w:sz="4"/>
+              <w:left w:val="single" w:color="E3D6DA" w:sz="4"/>
+              <w:bottom w:val="single" w:color="E3D6DA" w:sz="4"/>
+              <w:right w:val="single" w:color="E3D6DA" w:sz="4"/>
+            </w:tcBorders>
+            <w:shd w:fill="F7F2F3" w:color="auto" w:val="clear"/>
+            <w:tcMar>
+              <w:top w:type="dxa" w:w="70"/>
+              <w:left w:type="dxa" w:w="100"/>
+              <w:bottom w:type="dxa" w:w="70"/>
+              <w:right w:type="dxa" w:w="100"/>
+            </w:tcMar>
+            <w:vAlign w:val="top"/>
+          </w:tcPr>
+          <w:p>
+            <w:pPr>
+              <w:spacing w:after="40" w:line="252"/>
+              <w:jc w:val="left"/>
+            </w:pPr>
+            <w:r>
+              <w:rPr>
+                <w:rFonts w:ascii="Calibri" w:cs="Calibri" w:eastAsia="Calibri" w:hAnsi="Calibri"/>
+                <w:b/>
+                <w:bCs/>
+                <w:color w:val="2A1A20"/>
+                <w:sz w:val="16"/>
+                <w:szCs w:val="16"/>
+              </w:rPr>
+              <w:t xml:space="preserve">Attractivité du DAS</w:t>
+            </w:r>
+          </w:p>
+        </w:tc>
+        <w:tc>
+          <w:tcPr>
+            <w:tcW w:type="dxa" w:w="964"/>
+            <w:tcBorders>
+              <w:top w:val="single" w:color="E3D6DA" w:sz="4"/>
+              <w:left w:val="single" w:color="E3D6DA" w:sz="4"/>
+              <w:bottom w:val="single" w:color="E3D6DA" w:sz="4"/>
+              <w:right w:val="single" w:color="E3D6DA" w:sz="4"/>
+            </w:tcBorders>
+            <w:tcMar>
+              <w:top w:type="dxa" w:w="70"/>
+              <w:left w:type="dxa" w:w="100"/>
+              <w:bottom w:type="dxa" w:w="70"/>
+              <w:right w:type="dxa" w:w="100"/>
+            </w:tcMar>
+            <w:vAlign w:val="top"/>
+          </w:tcPr>
+          <w:p>
+            <w:pPr>
+              <w:spacing w:after="40" w:line="252"/>
+              <w:jc w:val="center"/>
+            </w:pPr>
+          </w:p>
+        </w:tc>
+        <w:tc>
+          <w:tcPr>
+            <w:tcW w:type="dxa" w:w="1205"/>
+            <w:tcBorders>
+              <w:top w:val="single" w:color="E3D6DA" w:sz="4"/>
+              <w:left w:val="single" w:color="E3D6DA" w:sz="4"/>
+              <w:bottom w:val="single" w:color="E3D6DA" w:sz="4"/>
+              <w:right w:val="single" w:color="E3D6DA" w:sz="4"/>
+            </w:tcBorders>
+            <w:tcMar>
+              <w:top w:type="dxa" w:w="70"/>
+              <w:left w:type="dxa" w:w="100"/>
+              <w:bottom w:type="dxa" w:w="70"/>
+              <w:right w:type="dxa" w:w="100"/>
+            </w:tcMar>
+            <w:vAlign w:val="top"/>
+          </w:tcPr>
+          <w:p>
+            <w:pPr>
+              <w:spacing w:after="40" w:line="252"/>
+              <w:jc w:val="center"/>
+            </w:pPr>
+          </w:p>
+        </w:tc>
+        <w:tc>
+          <w:tcPr>
+            <w:tcW w:type="dxa" w:w="1205"/>
+            <w:tcBorders>
+              <w:top w:val="single" w:color="E3D6DA" w:sz="4"/>
+              <w:left w:val="single" w:color="E3D6DA" w:sz="4"/>
+              <w:bottom w:val="single" w:color="E3D6DA" w:sz="4"/>
+              <w:right w:val="single" w:color="E3D6DA" w:sz="4"/>
+            </w:tcBorders>
+            <w:tcMar>
+              <w:top w:type="dxa" w:w="70"/>
+              <w:left w:type="dxa" w:w="100"/>
+              <w:bottom w:type="dxa" w:w="70"/>
+              <w:right w:type="dxa" w:w="100"/>
+            </w:tcMar>
+            <w:vAlign w:val="top"/>
+          </w:tcPr>
+          <w:p>
+            <w:pPr>
+              <w:spacing w:after="40" w:line="252"/>
+              <w:jc w:val="center"/>
+            </w:pPr>
+          </w:p>
+        </w:tc>
+        <w:tc>
+          <w:tcPr>
+            <w:tcW w:type="dxa" w:w="1205"/>
+            <w:tcBorders>
+              <w:top w:val="single" w:color="E3D6DA" w:sz="4"/>
+              <w:left w:val="single" w:color="E3D6DA" w:sz="4"/>
+              <w:bottom w:val="single" w:color="E3D6DA" w:sz="4"/>
+              <w:right w:val="single" w:color="E3D6DA" w:sz="4"/>
+            </w:tcBorders>
+            <w:tcMar>
+              <w:top w:type="dxa" w:w="70"/>
+              <w:left w:type="dxa" w:w="100"/>
+              <w:bottom w:type="dxa" w:w="70"/>
+              <w:right w:type="dxa" w:w="100"/>
+            </w:tcMar>
+            <w:vAlign w:val="top"/>
+          </w:tcPr>
+          <w:p>
+            <w:pPr>
+              <w:spacing w:after="40" w:line="252"/>
+              <w:jc w:val="center"/>
+            </w:pPr>
+          </w:p>
+        </w:tc>
+        <w:tc>
+          <w:tcPr>
+            <w:tcW w:type="dxa" w:w="1204"/>
+            <w:tcBorders>
+              <w:top w:val="single" w:color="E3D6DA" w:sz="4"/>
+              <w:left w:val="single" w:color="E3D6DA" w:sz="4"/>
+              <w:bottom w:val="single" w:color="E3D6DA" w:sz="4"/>
+              <w:right w:val="single" w:color="E3D6DA" w:sz="4"/>
+            </w:tcBorders>
+            <w:tcMar>
+              <w:top w:type="dxa" w:w="70"/>
+              <w:left w:type="dxa" w:w="100"/>
+              <w:bottom w:type="dxa" w:w="70"/>
+              <w:right w:type="dxa" w:w="100"/>
+            </w:tcMar>
+            <w:vAlign w:val="top"/>
+          </w:tcPr>
+          <w:p>
+            <w:pPr>
+              <w:spacing w:after="40" w:line="252"/>
+              <w:jc w:val="center"/>
+            </w:pPr>
+          </w:p>
+        </w:tc>
+      </w:tr>
+      <w:tr>
+        <w:tc>
+          <w:tcPr>
+            <w:tcW w:type="dxa" w:w="3855"/>
+            <w:tcBorders>
+              <w:top w:val="single" w:color="E3D6DA" w:sz="4"/>
+              <w:left w:val="single" w:color="E3D6DA" w:sz="4"/>
+              <w:bottom w:val="single" w:color="E3D6DA" w:sz="4"/>
+              <w:right w:val="single" w:color="E3D6DA" w:sz="4"/>
+            </w:tcBorders>
+            <w:shd w:fill="F7F2F3" w:color="auto" w:val="clear"/>
+            <w:tcMar>
+              <w:top w:type="dxa" w:w="70"/>
+              <w:left w:type="dxa" w:w="100"/>
+              <w:bottom w:type="dxa" w:w="70"/>
+              <w:right w:type="dxa" w:w="100"/>
+            </w:tcMar>
+            <w:vAlign w:val="top"/>
+          </w:tcPr>
+          <w:p>
+            <w:pPr>
+              <w:spacing w:after="40" w:line="252"/>
+              <w:jc w:val="left"/>
+            </w:pPr>
+            <w:r>
+              <w:rPr>
+                <w:rFonts w:ascii="Calibri" w:cs="Calibri" w:eastAsia="Calibri" w:hAnsi="Calibri"/>
+                <w:b/>
+                <w:bCs/>
+                <w:color w:val="2A1A20"/>
+                <w:sz w:val="16"/>
+                <w:szCs w:val="16"/>
+              </w:rPr>
+              <w:t xml:space="preserve">Taille du marché</w:t>
+            </w:r>
+          </w:p>
+        </w:tc>
+        <w:tc>
+          <w:tcPr>
+            <w:tcW w:type="dxa" w:w="964"/>
+            <w:tcBorders>
+              <w:top w:val="single" w:color="E3D6DA" w:sz="4"/>
+              <w:left w:val="single" w:color="E3D6DA" w:sz="4"/>
+              <w:bottom w:val="single" w:color="E3D6DA" w:sz="4"/>
+              <w:right w:val="single" w:color="E3D6DA" w:sz="4"/>
+            </w:tcBorders>
+            <w:tcMar>
+              <w:top w:type="dxa" w:w="70"/>
+              <w:left w:type="dxa" w:w="100"/>
+              <w:bottom w:type="dxa" w:w="70"/>
+              <w:right w:type="dxa" w:w="100"/>
+            </w:tcMar>
+            <w:vAlign w:val="top"/>
+          </w:tcPr>
+          <w:p>
+            <w:pPr>
+              <w:spacing w:after="40" w:line="252"/>
+              <w:jc w:val="center"/>
+            </w:pPr>
+            <w:r>
+              <w:rPr>
+                <w:rFonts w:ascii="Calibri" w:cs="Calibri" w:eastAsia="Calibri" w:hAnsi="Calibri"/>
+                <w:b w:val="false"/>
+                <w:bCs w:val="false"/>
+                <w:color w:val="2A1A20"/>
+                <w:sz w:val="16"/>
+                <w:szCs w:val="16"/>
+              </w:rPr>
+              <w:t xml:space="preserve">25 %</w:t>
+            </w:r>
+          </w:p>
+        </w:tc>
+        <w:tc>
+          <w:tcPr>
+            <w:tcW w:type="dxa" w:w="1205"/>
+            <w:tcBorders>
+              <w:top w:val="single" w:color="E3D6DA" w:sz="4"/>
+              <w:left w:val="single" w:color="E3D6DA" w:sz="4"/>
+              <w:bottom w:val="single" w:color="E3D6DA" w:sz="4"/>
+              <w:right w:val="single" w:color="E3D6DA" w:sz="4"/>
+            </w:tcBorders>
+            <w:tcMar>
+              <w:top w:type="dxa" w:w="70"/>
+              <w:left w:type="dxa" w:w="100"/>
+              <w:bottom w:type="dxa" w:w="70"/>
+              <w:right w:type="dxa" w:w="100"/>
+            </w:tcMar>
+            <w:vAlign w:val="top"/>
+          </w:tcPr>
+          <w:p>
+            <w:pPr>
+              <w:spacing w:after="40" w:line="252"/>
+              <w:jc w:val="center"/>
+            </w:pPr>
+            <w:r>
+              <w:rPr>
+                <w:rFonts w:ascii="Calibri" w:cs="Calibri" w:eastAsia="Calibri" w:hAnsi="Calibri"/>
+                <w:b w:val="false"/>
+                <w:bCs w:val="false"/>
+                <w:color w:val="2A1A20"/>
+                <w:sz w:val="16"/>
+                <w:szCs w:val="16"/>
+              </w:rPr>
+              <w:t xml:space="preserve">5</w:t>
+            </w:r>
+          </w:p>
+        </w:tc>
+        <w:tc>
+          <w:tcPr>
+            <w:tcW w:type="dxa" w:w="1205"/>
+            <w:tcBorders>
+              <w:top w:val="single" w:color="E3D6DA" w:sz="4"/>
+              <w:left w:val="single" w:color="E3D6DA" w:sz="4"/>
+              <w:bottom w:val="single" w:color="E3D6DA" w:sz="4"/>
+              <w:right w:val="single" w:color="E3D6DA" w:sz="4"/>
+            </w:tcBorders>
+            <w:tcMar>
+              <w:top w:type="dxa" w:w="70"/>
+              <w:left w:type="dxa" w:w="100"/>
+              <w:bottom w:type="dxa" w:w="70"/>
+              <w:right w:type="dxa" w:w="100"/>
+            </w:tcMar>
+            <w:vAlign w:val="top"/>
+          </w:tcPr>
+          <w:p>
+            <w:pPr>
+              <w:spacing w:after="40" w:line="252"/>
+              <w:jc w:val="center"/>
+            </w:pPr>
+            <w:r>
+              <w:rPr>
+                <w:rFonts w:ascii="Calibri" w:cs="Calibri" w:eastAsia="Calibri" w:hAnsi="Calibri"/>
+                <w:b w:val="false"/>
+                <w:bCs w:val="false"/>
+                <w:color w:val="2A1A20"/>
+                <w:sz w:val="16"/>
+                <w:szCs w:val="16"/>
+              </w:rPr>
+              <w:t xml:space="preserve">4</w:t>
+            </w:r>
+          </w:p>
+        </w:tc>
+        <w:tc>
+          <w:tcPr>
+            <w:tcW w:type="dxa" w:w="1205"/>
+            <w:tcBorders>
+              <w:top w:val="single" w:color="E3D6DA" w:sz="4"/>
+              <w:left w:val="single" w:color="E3D6DA" w:sz="4"/>
+              <w:bottom w:val="single" w:color="E3D6DA" w:sz="4"/>
+              <w:right w:val="single" w:color="E3D6DA" w:sz="4"/>
+            </w:tcBorders>
+            <w:tcMar>
+              <w:top w:type="dxa" w:w="70"/>
+              <w:left w:type="dxa" w:w="100"/>
+              <w:bottom w:type="dxa" w:w="70"/>
+              <w:right w:type="dxa" w:w="100"/>
+            </w:tcMar>
+            <w:vAlign w:val="top"/>
+          </w:tcPr>
+          <w:p>
+            <w:pPr>
+              <w:spacing w:after="40" w:line="252"/>
+              <w:jc w:val="center"/>
+            </w:pPr>
+            <w:r>
+              <w:rPr>
+                <w:rFonts w:ascii="Calibri" w:cs="Calibri" w:eastAsia="Calibri" w:hAnsi="Calibri"/>
+                <w:b w:val="false"/>
+                <w:bCs w:val="false"/>
+                <w:color w:val="2A1A20"/>
+                <w:sz w:val="16"/>
+                <w:szCs w:val="16"/>
+              </w:rPr>
+              <w:t xml:space="preserve">3</w:t>
+            </w:r>
+          </w:p>
+        </w:tc>
+        <w:tc>
+          <w:tcPr>
+            <w:tcW w:type="dxa" w:w="1204"/>
+            <w:tcBorders>
+              <w:top w:val="single" w:color="E3D6DA" w:sz="4"/>
+              <w:left w:val="single" w:color="E3D6DA" w:sz="4"/>
+              <w:bottom w:val="single" w:color="E3D6DA" w:sz="4"/>
+              <w:right w:val="single" w:color="E3D6DA" w:sz="4"/>
+            </w:tcBorders>
+            <w:tcMar>
+              <w:top w:type="dxa" w:w="70"/>
+              <w:left w:type="dxa" w:w="100"/>
+              <w:bottom w:type="dxa" w:w="70"/>
+              <w:right w:type="dxa" w:w="100"/>
+            </w:tcMar>
+            <w:vAlign w:val="top"/>
+          </w:tcPr>
+          <w:p>
+            <w:pPr>
+              <w:spacing w:after="40" w:line="252"/>
+              <w:jc w:val="center"/>
+            </w:pPr>
+            <w:r>
+              <w:rPr>
+                <w:rFonts w:ascii="Calibri" w:cs="Calibri" w:eastAsia="Calibri" w:hAnsi="Calibri"/>
+                <w:b w:val="false"/>
+                <w:bCs w:val="false"/>
+                <w:color w:val="2A1A20"/>
+                <w:sz w:val="16"/>
+                <w:szCs w:val="16"/>
+              </w:rPr>
+              <w:t xml:space="preserve">5</w:t>
+            </w:r>
+          </w:p>
+        </w:tc>
+      </w:tr>
+      <w:tr>
+        <w:tc>
+          <w:tcPr>
+            <w:tcW w:type="dxa" w:w="3855"/>
+            <w:tcBorders>
+              <w:top w:val="single" w:color="E3D6DA" w:sz="4"/>
+              <w:left w:val="single" w:color="E3D6DA" w:sz="4"/>
+              <w:bottom w:val="single" w:color="E3D6DA" w:sz="4"/>
+              <w:right w:val="single" w:color="E3D6DA" w:sz="4"/>
+            </w:tcBorders>
+            <w:shd w:fill="F7F2F3" w:color="auto" w:val="clear"/>
+            <w:tcMar>
+              <w:top w:type="dxa" w:w="70"/>
+              <w:left w:type="dxa" w:w="100"/>
+              <w:bottom w:type="dxa" w:w="70"/>
+              <w:right w:type="dxa" w:w="100"/>
+            </w:tcMar>
+            <w:vAlign w:val="top"/>
+          </w:tcPr>
+          <w:p>
+            <w:pPr>
+              <w:spacing w:after="40" w:line="252"/>
+              <w:jc w:val="left"/>
+            </w:pPr>
+            <w:r>
+              <w:rPr>
+                <w:rFonts w:ascii="Calibri" w:cs="Calibri" w:eastAsia="Calibri" w:hAnsi="Calibri"/>
+                <w:b/>
+                <w:bCs/>
+                <w:color w:val="2A1A20"/>
+                <w:sz w:val="16"/>
+                <w:szCs w:val="16"/>
+              </w:rPr>
+              <w:t xml:space="preserve">Croissance de la demande</w:t>
+            </w:r>
+          </w:p>
+        </w:tc>
+        <w:tc>
+          <w:tcPr>
+            <w:tcW w:type="dxa" w:w="964"/>
+            <w:tcBorders>
+              <w:top w:val="single" w:color="E3D6DA" w:sz="4"/>
+              <w:left w:val="single" w:color="E3D6DA" w:sz="4"/>
+              <w:bottom w:val="single" w:color="E3D6DA" w:sz="4"/>
+              <w:right w:val="single" w:color="E3D6DA" w:sz="4"/>
+            </w:tcBorders>
+            <w:tcMar>
+              <w:top w:type="dxa" w:w="70"/>
+              <w:left w:type="dxa" w:w="100"/>
+              <w:bottom w:type="dxa" w:w="70"/>
+              <w:right w:type="dxa" w:w="100"/>
+            </w:tcMar>
+            <w:vAlign w:val="top"/>
+          </w:tcPr>
+          <w:p>
+            <w:pPr>
+              <w:spacing w:after="40" w:line="252"/>
+              <w:jc w:val="center"/>
+            </w:pPr>
+            <w:r>
+              <w:rPr>
+                <w:rFonts w:ascii="Calibri" w:cs="Calibri" w:eastAsia="Calibri" w:hAnsi="Calibri"/>
+                <w:b w:val="false"/>
+                <w:bCs w:val="false"/>
+                <w:color w:val="2A1A20"/>
+                <w:sz w:val="16"/>
+                <w:szCs w:val="16"/>
+              </w:rPr>
+              <w:t xml:space="preserve">25 %</w:t>
+            </w:r>
+          </w:p>
+        </w:tc>
+        <w:tc>
+          <w:tcPr>
+            <w:tcW w:type="dxa" w:w="1205"/>
+            <w:tcBorders>
+              <w:top w:val="single" w:color="E3D6DA" w:sz="4"/>
+              <w:left w:val="single" w:color="E3D6DA" w:sz="4"/>
+              <w:bottom w:val="single" w:color="E3D6DA" w:sz="4"/>
+              <w:right w:val="single" w:color="E3D6DA" w:sz="4"/>
+            </w:tcBorders>
+            <w:tcMar>
+              <w:top w:type="dxa" w:w="70"/>
+              <w:left w:type="dxa" w:w="100"/>
+              <w:bottom w:type="dxa" w:w="70"/>
+              <w:right w:type="dxa" w:w="100"/>
+            </w:tcMar>
+            <w:vAlign w:val="top"/>
+          </w:tcPr>
+          <w:p>
+            <w:pPr>
+              <w:spacing w:after="40" w:line="252"/>
+              <w:jc w:val="center"/>
+            </w:pPr>
+            <w:r>
+              <w:rPr>
+                <w:rFonts w:ascii="Calibri" w:cs="Calibri" w:eastAsia="Calibri" w:hAnsi="Calibri"/>
+                <w:b w:val="false"/>
+                <w:bCs w:val="false"/>
+                <w:color w:val="2A1A20"/>
+                <w:sz w:val="16"/>
+                <w:szCs w:val="16"/>
+              </w:rPr>
+              <w:t xml:space="preserve">3</w:t>
+            </w:r>
+          </w:p>
+        </w:tc>
+        <w:tc>
+          <w:tcPr>
+            <w:tcW w:type="dxa" w:w="1205"/>
+            <w:tcBorders>
+              <w:top w:val="single" w:color="E3D6DA" w:sz="4"/>
+              <w:left w:val="single" w:color="E3D6DA" w:sz="4"/>
+              <w:bottom w:val="single" w:color="E3D6DA" w:sz="4"/>
+              <w:right w:val="single" w:color="E3D6DA" w:sz="4"/>
+            </w:tcBorders>
+            <w:tcMar>
+              <w:top w:type="dxa" w:w="70"/>
+              <w:left w:type="dxa" w:w="100"/>
+              <w:bottom w:type="dxa" w:w="70"/>
+              <w:right w:type="dxa" w:w="100"/>
+            </w:tcMar>
+            <w:vAlign w:val="top"/>
+          </w:tcPr>
+          <w:p>
+            <w:pPr>
+              <w:spacing w:after="40" w:line="252"/>
+              <w:jc w:val="center"/>
+            </w:pPr>
+            <w:r>
+              <w:rPr>
+                <w:rFonts w:ascii="Calibri" w:cs="Calibri" w:eastAsia="Calibri" w:hAnsi="Calibri"/>
+                <w:b w:val="false"/>
+                <w:bCs w:val="false"/>
+                <w:color w:val="2A1A20"/>
+                <w:sz w:val="16"/>
+                <w:szCs w:val="16"/>
+              </w:rPr>
+              <w:t xml:space="preserve">5</w:t>
+            </w:r>
+          </w:p>
+        </w:tc>
+        <w:tc>
+          <w:tcPr>
+            <w:tcW w:type="dxa" w:w="1205"/>
+            <w:tcBorders>
+              <w:top w:val="single" w:color="E3D6DA" w:sz="4"/>
+              <w:left w:val="single" w:color="E3D6DA" w:sz="4"/>
+              <w:bottom w:val="single" w:color="E3D6DA" w:sz="4"/>
+              <w:right w:val="single" w:color="E3D6DA" w:sz="4"/>
+            </w:tcBorders>
+            <w:tcMar>
+              <w:top w:type="dxa" w:w="70"/>
+              <w:left w:type="dxa" w:w="100"/>
+              <w:bottom w:type="dxa" w:w="70"/>
+              <w:right w:type="dxa" w:w="100"/>
+            </w:tcMar>
+            <w:vAlign w:val="top"/>
+          </w:tcPr>
+          <w:p>
+            <w:pPr>
+              <w:spacing w:after="40" w:line="252"/>
+              <w:jc w:val="center"/>
+            </w:pPr>
+            <w:r>
+              <w:rPr>
+                <w:rFonts w:ascii="Calibri" w:cs="Calibri" w:eastAsia="Calibri" w:hAnsi="Calibri"/>
+                <w:b w:val="false"/>
+                <w:bCs w:val="false"/>
+                <w:color w:val="2A1A20"/>
+                <w:sz w:val="16"/>
+                <w:szCs w:val="16"/>
+              </w:rPr>
+              <w:t xml:space="preserve">4</w:t>
+            </w:r>
+          </w:p>
+        </w:tc>
+        <w:tc>
+          <w:tcPr>
+            <w:tcW w:type="dxa" w:w="1204"/>
+            <w:tcBorders>
+              <w:top w:val="single" w:color="E3D6DA" w:sz="4"/>
+              <w:left w:val="single" w:color="E3D6DA" w:sz="4"/>
+              <w:bottom w:val="single" w:color="E3D6DA" w:sz="4"/>
+              <w:right w:val="single" w:color="E3D6DA" w:sz="4"/>
+            </w:tcBorders>
+            <w:tcMar>
+              <w:top w:type="dxa" w:w="70"/>
+              <w:left w:type="dxa" w:w="100"/>
+              <w:bottom w:type="dxa" w:w="70"/>
+              <w:right w:type="dxa" w:w="100"/>
+            </w:tcMar>
+            <w:vAlign w:val="top"/>
+          </w:tcPr>
+          <w:p>
+            <w:pPr>
+              <w:spacing w:after="40" w:line="252"/>
+              <w:jc w:val="center"/>
+            </w:pPr>
+            <w:r>
+              <w:rPr>
+                <w:rFonts w:ascii="Calibri" w:cs="Calibri" w:eastAsia="Calibri" w:hAnsi="Calibri"/>
+                <w:b w:val="false"/>
+                <w:bCs w:val="false"/>
+                <w:color w:val="2A1A20"/>
+                <w:sz w:val="16"/>
+                <w:szCs w:val="16"/>
+              </w:rPr>
+              <w:t xml:space="preserve">4</w:t>
+            </w:r>
+          </w:p>
+        </w:tc>
+      </w:tr>
+      <w:tr>
+        <w:tc>
+          <w:tcPr>
+            <w:tcW w:type="dxa" w:w="3855"/>
+            <w:tcBorders>
+              <w:top w:val="single" w:color="E3D6DA" w:sz="4"/>
+              <w:left w:val="single" w:color="E3D6DA" w:sz="4"/>
+              <w:bottom w:val="single" w:color="E3D6DA" w:sz="4"/>
+              <w:right w:val="single" w:color="E3D6DA" w:sz="4"/>
+            </w:tcBorders>
+            <w:shd w:fill="F7F2F3" w:color="auto" w:val="clear"/>
+            <w:tcMar>
+              <w:top w:type="dxa" w:w="70"/>
+              <w:left w:type="dxa" w:w="100"/>
+              <w:bottom w:type="dxa" w:w="70"/>
+              <w:right w:type="dxa" w:w="100"/>
+            </w:tcMar>
+            <w:vAlign w:val="top"/>
+          </w:tcPr>
+          <w:p>
+            <w:pPr>
+              <w:spacing w:after="40" w:line="252"/>
+              <w:jc w:val="left"/>
+            </w:pPr>
+            <w:r>
+              <w:rPr>
+                <w:rFonts w:ascii="Calibri" w:cs="Calibri" w:eastAsia="Calibri" w:hAnsi="Calibri"/>
+                <w:b/>
+                <w:bCs/>
+                <w:color w:val="2A1A20"/>
+                <w:sz w:val="16"/>
+                <w:szCs w:val="16"/>
+              </w:rPr>
+              <w:t xml:space="preserve">Intensité concurrentielle (5 = faible)</w:t>
+            </w:r>
+          </w:p>
+        </w:tc>
+        <w:tc>
+          <w:tcPr>
+            <w:tcW w:type="dxa" w:w="964"/>
+            <w:tcBorders>
+              <w:top w:val="single" w:color="E3D6DA" w:sz="4"/>
+              <w:left w:val="single" w:color="E3D6DA" w:sz="4"/>
+              <w:bottom w:val="single" w:color="E3D6DA" w:sz="4"/>
+              <w:right w:val="single" w:color="E3D6DA" w:sz="4"/>
+            </w:tcBorders>
+            <w:tcMar>
+              <w:top w:type="dxa" w:w="70"/>
+              <w:left w:type="dxa" w:w="100"/>
+              <w:bottom w:type="dxa" w:w="70"/>
+              <w:right w:type="dxa" w:w="100"/>
+            </w:tcMar>
+            <w:vAlign w:val="top"/>
+          </w:tcPr>
+          <w:p>
+            <w:pPr>
+              <w:spacing w:after="40" w:line="252"/>
+              <w:jc w:val="center"/>
+            </w:pPr>
+            <w:r>
+              <w:rPr>
+                <w:rFonts w:ascii="Calibri" w:cs="Calibri" w:eastAsia="Calibri" w:hAnsi="Calibri"/>
+                <w:b w:val="false"/>
+                <w:bCs w:val="false"/>
+                <w:color w:val="2A1A20"/>
+                <w:sz w:val="16"/>
+                <w:szCs w:val="16"/>
+              </w:rPr>
+              <w:t xml:space="preserve">30 %</w:t>
+            </w:r>
+          </w:p>
+        </w:tc>
+        <w:tc>
+          <w:tcPr>
+            <w:tcW w:type="dxa" w:w="1205"/>
+            <w:tcBorders>
+              <w:top w:val="single" w:color="E3D6DA" w:sz="4"/>
+              <w:left w:val="single" w:color="E3D6DA" w:sz="4"/>
+              <w:bottom w:val="single" w:color="E3D6DA" w:sz="4"/>
+              <w:right w:val="single" w:color="E3D6DA" w:sz="4"/>
+            </w:tcBorders>
+            <w:tcMar>
+              <w:top w:type="dxa" w:w="70"/>
+              <w:left w:type="dxa" w:w="100"/>
+              <w:bottom w:type="dxa" w:w="70"/>
+              <w:right w:type="dxa" w:w="100"/>
+            </w:tcMar>
+            <w:vAlign w:val="top"/>
+          </w:tcPr>
+          <w:p>
+            <w:pPr>
+              <w:spacing w:after="40" w:line="252"/>
+              <w:jc w:val="center"/>
+            </w:pPr>
+            <w:r>
+              <w:rPr>
+                <w:rFonts w:ascii="Calibri" w:cs="Calibri" w:eastAsia="Calibri" w:hAnsi="Calibri"/>
+                <w:b w:val="false"/>
+                <w:bCs w:val="false"/>
+                <w:color w:val="2A1A20"/>
+                <w:sz w:val="16"/>
+                <w:szCs w:val="16"/>
+              </w:rPr>
+              <w:t xml:space="preserve">1</w:t>
+            </w:r>
+          </w:p>
+        </w:tc>
+        <w:tc>
+          <w:tcPr>
+            <w:tcW w:type="dxa" w:w="1205"/>
+            <w:tcBorders>
+              <w:top w:val="single" w:color="E3D6DA" w:sz="4"/>
+              <w:left w:val="single" w:color="E3D6DA" w:sz="4"/>
+              <w:bottom w:val="single" w:color="E3D6DA" w:sz="4"/>
+              <w:right w:val="single" w:color="E3D6DA" w:sz="4"/>
+            </w:tcBorders>
+            <w:tcMar>
+              <w:top w:type="dxa" w:w="70"/>
+              <w:left w:type="dxa" w:w="100"/>
+              <w:bottom w:type="dxa" w:w="70"/>
+              <w:right w:type="dxa" w:w="100"/>
+            </w:tcMar>
+            <w:vAlign w:val="top"/>
+          </w:tcPr>
+          <w:p>
+            <w:pPr>
+              <w:spacing w:after="40" w:line="252"/>
+              <w:jc w:val="center"/>
+            </w:pPr>
+            <w:r>
+              <w:rPr>
+                <w:rFonts w:ascii="Calibri" w:cs="Calibri" w:eastAsia="Calibri" w:hAnsi="Calibri"/>
+                <w:b w:val="false"/>
+                <w:bCs w:val="false"/>
+                <w:color w:val="2A1A20"/>
+                <w:sz w:val="16"/>
+                <w:szCs w:val="16"/>
+              </w:rPr>
+              <w:t xml:space="preserve">4</w:t>
+            </w:r>
+          </w:p>
+        </w:tc>
+        <w:tc>
+          <w:tcPr>
+            <w:tcW w:type="dxa" w:w="1205"/>
+            <w:tcBorders>
+              <w:top w:val="single" w:color="E3D6DA" w:sz="4"/>
+              <w:left w:val="single" w:color="E3D6DA" w:sz="4"/>
+              <w:bottom w:val="single" w:color="E3D6DA" w:sz="4"/>
+              <w:right w:val="single" w:color="E3D6DA" w:sz="4"/>
+            </w:tcBorders>
+            <w:tcMar>
+              <w:top w:type="dxa" w:w="70"/>
+              <w:left w:type="dxa" w:w="100"/>
+              <w:bottom w:type="dxa" w:w="70"/>
+              <w:right w:type="dxa" w:w="100"/>
+            </w:tcMar>
+            <w:vAlign w:val="top"/>
+          </w:tcPr>
+          <w:p>
+            <w:pPr>
+              <w:spacing w:after="40" w:line="252"/>
+              <w:jc w:val="center"/>
+            </w:pPr>
+            <w:r>
+              <w:rPr>
+                <w:rFonts w:ascii="Calibri" w:cs="Calibri" w:eastAsia="Calibri" w:hAnsi="Calibri"/>
+                <w:b w:val="false"/>
+                <w:bCs w:val="false"/>
+                <w:color w:val="2A1A20"/>
+                <w:sz w:val="16"/>
+                <w:szCs w:val="16"/>
+              </w:rPr>
+              <w:t xml:space="preserve">3</w:t>
+            </w:r>
+          </w:p>
+        </w:tc>
+        <w:tc>
+          <w:tcPr>
+            <w:tcW w:type="dxa" w:w="1204"/>
+            <w:tcBorders>
+              <w:top w:val="single" w:color="E3D6DA" w:sz="4"/>
+              <w:left w:val="single" w:color="E3D6DA" w:sz="4"/>
+              <w:bottom w:val="single" w:color="E3D6DA" w:sz="4"/>
+              <w:right w:val="single" w:color="E3D6DA" w:sz="4"/>
+            </w:tcBorders>
+            <w:tcMar>
+              <w:top w:type="dxa" w:w="70"/>
+              <w:left w:type="dxa" w:w="100"/>
+              <w:bottom w:type="dxa" w:w="70"/>
+              <w:right w:type="dxa" w:w="100"/>
+            </w:tcMar>
+            <w:vAlign w:val="top"/>
+          </w:tcPr>
+          <w:p>
+            <w:pPr>
+              <w:spacing w:after="40" w:line="252"/>
+              <w:jc w:val="center"/>
+            </w:pPr>
+            <w:r>
+              <w:rPr>
+                <w:rFonts w:ascii="Calibri" w:cs="Calibri" w:eastAsia="Calibri" w:hAnsi="Calibri"/>
+                <w:b w:val="false"/>
+                <w:bCs w:val="false"/>
+                <w:color w:val="2A1A20"/>
+                <w:sz w:val="16"/>
+                <w:szCs w:val="16"/>
+              </w:rPr>
+              <w:t xml:space="preserve">3</w:t>
+            </w:r>
+          </w:p>
+        </w:tc>
+      </w:tr>
+      <w:tr>
+        <w:tc>
+          <w:tcPr>
+            <w:tcW w:type="dxa" w:w="3855"/>
+            <w:tcBorders>
+              <w:top w:val="single" w:color="E3D6DA" w:sz="4"/>
+              <w:left w:val="single" w:color="E3D6DA" w:sz="4"/>
+              <w:bottom w:val="single" w:color="E3D6DA" w:sz="4"/>
+              <w:right w:val="single" w:color="E3D6DA" w:sz="4"/>
+            </w:tcBorders>
+            <w:shd w:fill="F7F2F3" w:color="auto" w:val="clear"/>
+            <w:tcMar>
+              <w:top w:type="dxa" w:w="70"/>
+              <w:left w:type="dxa" w:w="100"/>
+              <w:bottom w:type="dxa" w:w="70"/>
+              <w:right w:type="dxa" w:w="100"/>
+            </w:tcMar>
+            <w:vAlign w:val="top"/>
+          </w:tcPr>
+          <w:p>
+            <w:pPr>
+              <w:spacing w:after="40" w:line="252"/>
+              <w:jc w:val="left"/>
+            </w:pPr>
+            <w:r>
+              <w:rPr>
+                <w:rFonts w:ascii="Calibri" w:cs="Calibri" w:eastAsia="Calibri" w:hAnsi="Calibri"/>
+                <w:b/>
+                <w:bCs/>
+                <w:color w:val="2A1A20"/>
+                <w:sz w:val="16"/>
+                <w:szCs w:val="16"/>
+              </w:rPr>
+              <w:t xml:space="preserve">Barrières réglementaires et sécurité (5 = faibles)</w:t>
+            </w:r>
+          </w:p>
+        </w:tc>
+        <w:tc>
+          <w:tcPr>
+            <w:tcW w:type="dxa" w:w="964"/>
+            <w:tcBorders>
+              <w:top w:val="single" w:color="E3D6DA" w:sz="4"/>
+              <w:left w:val="single" w:color="E3D6DA" w:sz="4"/>
+              <w:bottom w:val="single" w:color="E3D6DA" w:sz="4"/>
+              <w:right w:val="single" w:color="E3D6DA" w:sz="4"/>
+            </w:tcBorders>
+            <w:tcMar>
+              <w:top w:type="dxa" w:w="70"/>
+              <w:left w:type="dxa" w:w="100"/>
+              <w:bottom w:type="dxa" w:w="70"/>
+              <w:right w:type="dxa" w:w="100"/>
+            </w:tcMar>
+            <w:vAlign w:val="top"/>
+          </w:tcPr>
+          <w:p>
+            <w:pPr>
+              <w:spacing w:after="40" w:line="252"/>
+              <w:jc w:val="center"/>
+            </w:pPr>
+            <w:r>
+              <w:rPr>
+                <w:rFonts w:ascii="Calibri" w:cs="Calibri" w:eastAsia="Calibri" w:hAnsi="Calibri"/>
+                <w:b w:val="false"/>
+                <w:bCs w:val="false"/>
+                <w:color w:val="2A1A20"/>
+                <w:sz w:val="16"/>
+                <w:szCs w:val="16"/>
+              </w:rPr>
+              <w:t xml:space="preserve">20 %</w:t>
+            </w:r>
+          </w:p>
+        </w:tc>
+        <w:tc>
+          <w:tcPr>
+            <w:tcW w:type="dxa" w:w="1205"/>
+            <w:tcBorders>
+              <w:top w:val="single" w:color="E3D6DA" w:sz="4"/>
+              <w:left w:val="single" w:color="E3D6DA" w:sz="4"/>
+              <w:bottom w:val="single" w:color="E3D6DA" w:sz="4"/>
+              <w:right w:val="single" w:color="E3D6DA" w:sz="4"/>
+            </w:tcBorders>
+            <w:tcMar>
+              <w:top w:type="dxa" w:w="70"/>
+              <w:left w:type="dxa" w:w="100"/>
+              <w:bottom w:type="dxa" w:w="70"/>
+              <w:right w:type="dxa" w:w="100"/>
+            </w:tcMar>
+            <w:vAlign w:val="top"/>
+          </w:tcPr>
+          <w:p>
+            <w:pPr>
+              <w:spacing w:after="40" w:line="252"/>
+              <w:jc w:val="center"/>
+            </w:pPr>
+            <w:r>
+              <w:rPr>
+                <w:rFonts w:ascii="Calibri" w:cs="Calibri" w:eastAsia="Calibri" w:hAnsi="Calibri"/>
+                <w:b w:val="false"/>
+                <w:bCs w:val="false"/>
+                <w:color w:val="2A1A20"/>
+                <w:sz w:val="16"/>
+                <w:szCs w:val="16"/>
+              </w:rPr>
+              <w:t xml:space="preserve">4</w:t>
+            </w:r>
+          </w:p>
+        </w:tc>
+        <w:tc>
+          <w:tcPr>
+            <w:tcW w:type="dxa" w:w="1205"/>
+            <w:tcBorders>
+              <w:top w:val="single" w:color="E3D6DA" w:sz="4"/>
+              <w:left w:val="single" w:color="E3D6DA" w:sz="4"/>
+              <w:bottom w:val="single" w:color="E3D6DA" w:sz="4"/>
+              <w:right w:val="single" w:color="E3D6DA" w:sz="4"/>
+            </w:tcBorders>
+            <w:tcMar>
+              <w:top w:type="dxa" w:w="70"/>
+              <w:left w:type="dxa" w:w="100"/>
+              <w:bottom w:type="dxa" w:w="70"/>
+              <w:right w:type="dxa" w:w="100"/>
+            </w:tcMar>
+            <w:vAlign w:val="top"/>
+          </w:tcPr>
+          <w:p>
+            <w:pPr>
+              <w:spacing w:after="40" w:line="252"/>
+              <w:jc w:val="center"/>
+            </w:pPr>
+            <w:r>
+              <w:rPr>
+                <w:rFonts w:ascii="Calibri" w:cs="Calibri" w:eastAsia="Calibri" w:hAnsi="Calibri"/>
+                <w:b w:val="false"/>
+                <w:bCs w:val="false"/>
+                <w:color w:val="2A1A20"/>
+                <w:sz w:val="16"/>
+                <w:szCs w:val="16"/>
+              </w:rPr>
+              <w:t xml:space="preserve">3</w:t>
+            </w:r>
+          </w:p>
+        </w:tc>
+        <w:tc>
+          <w:tcPr>
+            <w:tcW w:type="dxa" w:w="1205"/>
+            <w:tcBorders>
+              <w:top w:val="single" w:color="E3D6DA" w:sz="4"/>
+              <w:left w:val="single" w:color="E3D6DA" w:sz="4"/>
+              <w:bottom w:val="single" w:color="E3D6DA" w:sz="4"/>
+              <w:right w:val="single" w:color="E3D6DA" w:sz="4"/>
+            </w:tcBorders>
+            <w:tcMar>
+              <w:top w:type="dxa" w:w="70"/>
+              <w:left w:type="dxa" w:w="100"/>
+              <w:bottom w:type="dxa" w:w="70"/>
+              <w:right w:type="dxa" w:w="100"/>
+            </w:tcMar>
+            <w:vAlign w:val="top"/>
+          </w:tcPr>
+          <w:p>
+            <w:pPr>
+              <w:spacing w:after="40" w:line="252"/>
+              <w:jc w:val="center"/>
+            </w:pPr>
+            <w:r>
+              <w:rPr>
+                <w:rFonts w:ascii="Calibri" w:cs="Calibri" w:eastAsia="Calibri" w:hAnsi="Calibri"/>
+                <w:b w:val="false"/>
+                <w:bCs w:val="false"/>
+                <w:color w:val="2A1A20"/>
+                <w:sz w:val="16"/>
+                <w:szCs w:val="16"/>
+              </w:rPr>
+              <w:t xml:space="preserve">2</w:t>
+            </w:r>
+          </w:p>
+        </w:tc>
+        <w:tc>
+          <w:tcPr>
+            <w:tcW w:type="dxa" w:w="1204"/>
+            <w:tcBorders>
+              <w:top w:val="single" w:color="E3D6DA" w:sz="4"/>
+              <w:left w:val="single" w:color="E3D6DA" w:sz="4"/>
+              <w:bottom w:val="single" w:color="E3D6DA" w:sz="4"/>
+              <w:right w:val="single" w:color="E3D6DA" w:sz="4"/>
+            </w:tcBorders>
+            <w:tcMar>
+              <w:top w:type="dxa" w:w="70"/>
+              <w:left w:type="dxa" w:w="100"/>
+              <w:bottom w:type="dxa" w:w="70"/>
+              <w:right w:type="dxa" w:w="100"/>
+            </w:tcMar>
+            <w:vAlign w:val="top"/>
+          </w:tcPr>
+          <w:p>
+            <w:pPr>
+              <w:spacing w:after="40" w:line="252"/>
+              <w:jc w:val="center"/>
+            </w:pPr>
+            <w:r>
+              <w:rPr>
+                <w:rFonts w:ascii="Calibri" w:cs="Calibri" w:eastAsia="Calibri" w:hAnsi="Calibri"/>
+                <w:b w:val="false"/>
+                <w:bCs w:val="false"/>
+                <w:color w:val="2A1A20"/>
+                <w:sz w:val="16"/>
+                <w:szCs w:val="16"/>
+              </w:rPr>
+              <w:t xml:space="preserve">2</w:t>
+            </w:r>
+          </w:p>
+        </w:tc>
+      </w:tr>
+      <w:tr>
+        <w:tc>
+          <w:tcPr>
+            <w:tcW w:type="dxa" w:w="3855"/>
+            <w:tcBorders>
+              <w:top w:val="single" w:color="E3D6DA" w:sz="4"/>
+              <w:left w:val="single" w:color="E3D6DA" w:sz="4"/>
+              <w:bottom w:val="single" w:color="E3D6DA" w:sz="4"/>
+              <w:right w:val="single" w:color="E3D6DA" w:sz="4"/>
+            </w:tcBorders>
+            <w:shd w:fill="F7F2F3" w:color="auto" w:val="clear"/>
+            <w:tcMar>
+              <w:top w:type="dxa" w:w="70"/>
+              <w:left w:type="dxa" w:w="100"/>
+              <w:bottom w:type="dxa" w:w="70"/>
+              <w:right w:type="dxa" w:w="100"/>
+            </w:tcMar>
+            <w:vAlign w:val="top"/>
+          </w:tcPr>
+          <w:p>
+            <w:pPr>
+              <w:spacing w:after="40" w:line="252"/>
+              <w:jc w:val="left"/>
+            </w:pPr>
+            <w:r>
+              <w:rPr>
+                <w:rFonts w:ascii="Calibri" w:cs="Calibri" w:eastAsia="Calibri" w:hAnsi="Calibri"/>
+                <w:b/>
+                <w:bCs/>
+                <w:color w:val="2A1A20"/>
+                <w:sz w:val="16"/>
+                <w:szCs w:val="16"/>
+              </w:rPr>
+              <w:t xml:space="preserve">Note d'attractivité / 5</w:t>
+            </w:r>
+          </w:p>
+        </w:tc>
+        <w:tc>
+          <w:tcPr>
+            <w:tcW w:type="dxa" w:w="964"/>
+            <w:tcBorders>
+              <w:top w:val="single" w:color="E3D6DA" w:sz="4"/>
+              <w:left w:val="single" w:color="E3D6DA" w:sz="4"/>
+              <w:bottom w:val="single" w:color="E3D6DA" w:sz="4"/>
+              <w:right w:val="single" w:color="E3D6DA" w:sz="4"/>
+            </w:tcBorders>
+            <w:tcMar>
+              <w:top w:type="dxa" w:w="70"/>
+              <w:left w:type="dxa" w:w="100"/>
+              <w:bottom w:type="dxa" w:w="70"/>
+              <w:right w:type="dxa" w:w="100"/>
+            </w:tcMar>
+            <w:vAlign w:val="top"/>
+          </w:tcPr>
+          <w:p>
+            <w:pPr>
+              <w:spacing w:after="40" w:line="252"/>
+              <w:jc w:val="center"/>
+            </w:pPr>
+            <w:r>
+              <w:rPr>
+                <w:rFonts w:ascii="Calibri" w:cs="Calibri" w:eastAsia="Calibri" w:hAnsi="Calibri"/>
+                <w:b w:val="false"/>
+                <w:bCs w:val="false"/>
+                <w:color w:val="2A1A20"/>
+                <w:sz w:val="16"/>
+                <w:szCs w:val="16"/>
+              </w:rPr>
+              <w:t xml:space="preserve">100 %</w:t>
+            </w:r>
+          </w:p>
+        </w:tc>
+        <w:tc>
+          <w:tcPr>
+            <w:tcW w:type="dxa" w:w="1205"/>
+            <w:tcBorders>
+              <w:top w:val="single" w:color="E3D6DA" w:sz="4"/>
+              <w:left w:val="single" w:color="E3D6DA" w:sz="4"/>
+              <w:bottom w:val="single" w:color="E3D6DA" w:sz="4"/>
+              <w:right w:val="single" w:color="E3D6DA" w:sz="4"/>
+            </w:tcBorders>
+            <w:tcMar>
+              <w:top w:type="dxa" w:w="70"/>
+              <w:left w:type="dxa" w:w="100"/>
+              <w:bottom w:type="dxa" w:w="70"/>
+              <w:right w:type="dxa" w:w="100"/>
+            </w:tcMar>
+            <w:vAlign w:val="top"/>
+          </w:tcPr>
+          <w:p>
+            <w:pPr>
+              <w:spacing w:after="40" w:line="252"/>
+              <w:jc w:val="center"/>
+            </w:pPr>
+            <w:r>
+              <w:rPr>
+                <w:rFonts w:ascii="Calibri" w:cs="Calibri" w:eastAsia="Calibri" w:hAnsi="Calibri"/>
+                <w:b/>
+                <w:bCs/>
+                <w:color w:val="2A1A20"/>
+                <w:sz w:val="16"/>
+                <w:szCs w:val="16"/>
+              </w:rPr>
+              <w:t xml:space="preserve">3,10</w:t>
+            </w:r>
+          </w:p>
+        </w:tc>
+        <w:tc>
+          <w:tcPr>
+            <w:tcW w:type="dxa" w:w="1205"/>
+            <w:tcBorders>
+              <w:top w:val="single" w:color="E3D6DA" w:sz="4"/>
+              <w:left w:val="single" w:color="E3D6DA" w:sz="4"/>
+              <w:bottom w:val="single" w:color="E3D6DA" w:sz="4"/>
+              <w:right w:val="single" w:color="E3D6DA" w:sz="4"/>
+            </w:tcBorders>
+            <w:tcMar>
+              <w:top w:type="dxa" w:w="70"/>
+              <w:left w:type="dxa" w:w="100"/>
+              <w:bottom w:type="dxa" w:w="70"/>
+              <w:right w:type="dxa" w:w="100"/>
+            </w:tcMar>
+            <w:vAlign w:val="top"/>
+          </w:tcPr>
+          <w:p>
+            <w:pPr>
+              <w:spacing w:after="40" w:line="252"/>
+              <w:jc w:val="center"/>
+            </w:pPr>
+            <w:r>
+              <w:rPr>
+                <w:rFonts w:ascii="Calibri" w:cs="Calibri" w:eastAsia="Calibri" w:hAnsi="Calibri"/>
+                <w:b/>
+                <w:bCs/>
+                <w:color w:val="2A1A20"/>
+                <w:sz w:val="16"/>
+                <w:szCs w:val="16"/>
+              </w:rPr>
+              <w:t xml:space="preserve">4,05</w:t>
+            </w:r>
+          </w:p>
+        </w:tc>
+        <w:tc>
+          <w:tcPr>
+            <w:tcW w:type="dxa" w:w="1205"/>
+            <w:tcBorders>
+              <w:top w:val="single" w:color="E3D6DA" w:sz="4"/>
+              <w:left w:val="single" w:color="E3D6DA" w:sz="4"/>
+              <w:bottom w:val="single" w:color="E3D6DA" w:sz="4"/>
+              <w:right w:val="single" w:color="E3D6DA" w:sz="4"/>
+            </w:tcBorders>
+            <w:tcMar>
+              <w:top w:type="dxa" w:w="70"/>
+              <w:left w:type="dxa" w:w="100"/>
+              <w:bottom w:type="dxa" w:w="70"/>
+              <w:right w:type="dxa" w:w="100"/>
+            </w:tcMar>
+            <w:vAlign w:val="top"/>
+          </w:tcPr>
+          <w:p>
+            <w:pPr>
+              <w:spacing w:after="40" w:line="252"/>
+              <w:jc w:val="center"/>
+            </w:pPr>
+            <w:r>
+              <w:rPr>
+                <w:rFonts w:ascii="Calibri" w:cs="Calibri" w:eastAsia="Calibri" w:hAnsi="Calibri"/>
+                <w:b/>
+                <w:bCs/>
+                <w:color w:val="2A1A20"/>
+                <w:sz w:val="16"/>
+                <w:szCs w:val="16"/>
+              </w:rPr>
+              <w:t xml:space="preserve">3,05</w:t>
+            </w:r>
+          </w:p>
+        </w:tc>
+        <w:tc>
+          <w:tcPr>
+            <w:tcW w:type="dxa" w:w="1204"/>
+            <w:tcBorders>
+              <w:top w:val="single" w:color="E3D6DA" w:sz="4"/>
+              <w:left w:val="single" w:color="E3D6DA" w:sz="4"/>
+              <w:bottom w:val="single" w:color="E3D6DA" w:sz="4"/>
+              <w:right w:val="single" w:color="E3D6DA" w:sz="4"/>
+            </w:tcBorders>
+            <w:tcMar>
+              <w:top w:type="dxa" w:w="70"/>
+              <w:left w:type="dxa" w:w="100"/>
+              <w:bottom w:type="dxa" w:w="70"/>
+              <w:right w:type="dxa" w:w="100"/>
+            </w:tcMar>
+            <w:vAlign w:val="top"/>
+          </w:tcPr>
+          <w:p>
+            <w:pPr>
+              <w:spacing w:after="40" w:line="252"/>
+              <w:jc w:val="center"/>
+            </w:pPr>
+            <w:r>
+              <w:rPr>
+                <w:rFonts w:ascii="Calibri" w:cs="Calibri" w:eastAsia="Calibri" w:hAnsi="Calibri"/>
+                <w:b/>
+                <w:bCs/>
+                <w:color w:val="2A1A20"/>
+                <w:sz w:val="16"/>
+                <w:szCs w:val="16"/>
+              </w:rPr>
+              <w:t xml:space="preserve">3,55</w:t>
+            </w:r>
+          </w:p>
+        </w:tc>
+      </w:tr>
+      <w:tr>
+        <w:tc>
+          <w:tcPr>
+            <w:tcW w:type="dxa" w:w="3855"/>
+            <w:tcBorders>
+              <w:top w:val="single" w:color="E3D6DA" w:sz="4"/>
+              <w:left w:val="single" w:color="E3D6DA" w:sz="4"/>
+              <w:bottom w:val="single" w:color="E3D6DA" w:sz="4"/>
+              <w:right w:val="single" w:color="E3D6DA" w:sz="4"/>
+            </w:tcBorders>
+            <w:shd w:fill="F7F2F3" w:color="auto" w:val="clear"/>
+            <w:tcMar>
+              <w:top w:type="dxa" w:w="70"/>
+              <w:left w:type="dxa" w:w="100"/>
+              <w:bottom w:type="dxa" w:w="70"/>
+              <w:right w:type="dxa" w:w="100"/>
+            </w:tcMar>
+            <w:vAlign w:val="top"/>
+          </w:tcPr>
+          <w:p>
+            <w:pPr>
+              <w:spacing w:after="40" w:line="252"/>
+              <w:jc w:val="left"/>
+            </w:pPr>
+            <w:r>
+              <w:rPr>
+                <w:rFonts w:ascii="Calibri" w:cs="Calibri" w:eastAsia="Calibri" w:hAnsi="Calibri"/>
+                <w:b/>
+                <w:bCs/>
+                <w:color w:val="2A1A20"/>
+                <w:sz w:val="16"/>
+                <w:szCs w:val="16"/>
+              </w:rPr>
+              <w:t xml:space="preserve">Atouts du projet</w:t>
+            </w:r>
+          </w:p>
+        </w:tc>
+        <w:tc>
+          <w:tcPr>
+            <w:tcW w:type="dxa" w:w="964"/>
+            <w:tcBorders>
+              <w:top w:val="single" w:color="E3D6DA" w:sz="4"/>
+              <w:left w:val="single" w:color="E3D6DA" w:sz="4"/>
+              <w:bottom w:val="single" w:color="E3D6DA" w:sz="4"/>
+              <w:right w:val="single" w:color="E3D6DA" w:sz="4"/>
+            </w:tcBorders>
+            <w:tcMar>
+              <w:top w:type="dxa" w:w="70"/>
+              <w:left w:type="dxa" w:w="100"/>
+              <w:bottom w:type="dxa" w:w="70"/>
+              <w:right w:type="dxa" w:w="100"/>
+            </w:tcMar>
+            <w:vAlign w:val="top"/>
+          </w:tcPr>
+          <w:p>
+            <w:pPr>
+              <w:spacing w:after="40" w:line="252"/>
+              <w:jc w:val="center"/>
+            </w:pPr>
+          </w:p>
+        </w:tc>
+        <w:tc>
+          <w:tcPr>
+            <w:tcW w:type="dxa" w:w="1205"/>
+            <w:tcBorders>
+              <w:top w:val="single" w:color="E3D6DA" w:sz="4"/>
+              <w:left w:val="single" w:color="E3D6DA" w:sz="4"/>
+              <w:bottom w:val="single" w:color="E3D6DA" w:sz="4"/>
+              <w:right w:val="single" w:color="E3D6DA" w:sz="4"/>
+            </w:tcBorders>
+            <w:tcMar>
+              <w:top w:type="dxa" w:w="70"/>
+              <w:left w:type="dxa" w:w="100"/>
+              <w:bottom w:type="dxa" w:w="70"/>
+              <w:right w:type="dxa" w:w="100"/>
+            </w:tcMar>
+            <w:vAlign w:val="top"/>
+          </w:tcPr>
+          <w:p>
+            <w:pPr>
+              <w:spacing w:after="40" w:line="252"/>
+              <w:jc w:val="center"/>
+            </w:pPr>
+          </w:p>
+        </w:tc>
+        <w:tc>
+          <w:tcPr>
+            <w:tcW w:type="dxa" w:w="1205"/>
+            <w:tcBorders>
+              <w:top w:val="single" w:color="E3D6DA" w:sz="4"/>
+              <w:left w:val="single" w:color="E3D6DA" w:sz="4"/>
+              <w:bottom w:val="single" w:color="E3D6DA" w:sz="4"/>
+              <w:right w:val="single" w:color="E3D6DA" w:sz="4"/>
+            </w:tcBorders>
+            <w:tcMar>
+              <w:top w:type="dxa" w:w="70"/>
+              <w:left w:type="dxa" w:w="100"/>
+              <w:bottom w:type="dxa" w:w="70"/>
+              <w:right w:type="dxa" w:w="100"/>
+            </w:tcMar>
+            <w:vAlign w:val="top"/>
+          </w:tcPr>
+          <w:p>
+            <w:pPr>
+              <w:spacing w:after="40" w:line="252"/>
+              <w:jc w:val="center"/>
+            </w:pPr>
+          </w:p>
+        </w:tc>
+        <w:tc>
+          <w:tcPr>
+            <w:tcW w:type="dxa" w:w="1205"/>
+            <w:tcBorders>
+              <w:top w:val="single" w:color="E3D6DA" w:sz="4"/>
+              <w:left w:val="single" w:color="E3D6DA" w:sz="4"/>
+              <w:bottom w:val="single" w:color="E3D6DA" w:sz="4"/>
+              <w:right w:val="single" w:color="E3D6DA" w:sz="4"/>
+            </w:tcBorders>
+            <w:tcMar>
+              <w:top w:type="dxa" w:w="70"/>
+              <w:left w:type="dxa" w:w="100"/>
+              <w:bottom w:type="dxa" w:w="70"/>
+              <w:right w:type="dxa" w:w="100"/>
+            </w:tcMar>
+            <w:vAlign w:val="top"/>
+          </w:tcPr>
+          <w:p>
+            <w:pPr>
+              <w:spacing w:after="40" w:line="252"/>
+              <w:jc w:val="center"/>
+            </w:pPr>
+          </w:p>
+        </w:tc>
+        <w:tc>
+          <w:tcPr>
+            <w:tcW w:type="dxa" w:w="1204"/>
+            <w:tcBorders>
+              <w:top w:val="single" w:color="E3D6DA" w:sz="4"/>
+              <w:left w:val="single" w:color="E3D6DA" w:sz="4"/>
+              <w:bottom w:val="single" w:color="E3D6DA" w:sz="4"/>
+              <w:right w:val="single" w:color="E3D6DA" w:sz="4"/>
+            </w:tcBorders>
+            <w:tcMar>
+              <w:top w:type="dxa" w:w="70"/>
+              <w:left w:type="dxa" w:w="100"/>
+              <w:bottom w:type="dxa" w:w="70"/>
+              <w:right w:type="dxa" w:w="100"/>
+            </w:tcMar>
+            <w:vAlign w:val="top"/>
+          </w:tcPr>
+          <w:p>
+            <w:pPr>
+              <w:spacing w:after="40" w:line="252"/>
+              <w:jc w:val="center"/>
+            </w:pPr>
+          </w:p>
+        </w:tc>
+      </w:tr>
+      <w:tr>
+        <w:tc>
+          <w:tcPr>
+            <w:tcW w:type="dxa" w:w="3855"/>
+            <w:tcBorders>
+              <w:top w:val="single" w:color="E3D6DA" w:sz="4"/>
+              <w:left w:val="single" w:color="E3D6DA" w:sz="4"/>
+              <w:bottom w:val="single" w:color="E3D6DA" w:sz="4"/>
+              <w:right w:val="single" w:color="E3D6DA" w:sz="4"/>
+            </w:tcBorders>
+            <w:shd w:fill="F7F2F3" w:color="auto" w:val="clear"/>
+            <w:tcMar>
+              <w:top w:type="dxa" w:w="70"/>
+              <w:left w:type="dxa" w:w="100"/>
+              <w:bottom w:type="dxa" w:w="70"/>
+              <w:right w:type="dxa" w:w="100"/>
+            </w:tcMar>
+            <w:vAlign w:val="top"/>
+          </w:tcPr>
+          <w:p>
+            <w:pPr>
+              <w:spacing w:after="40" w:line="252"/>
+              <w:jc w:val="left"/>
+            </w:pPr>
+            <w:r>
+              <w:rPr>
+                <w:rFonts w:ascii="Calibri" w:cs="Calibri" w:eastAsia="Calibri" w:hAnsi="Calibri"/>
+                <w:b/>
+                <w:bCs/>
+                <w:color w:val="2A1A20"/>
+                <w:sz w:val="16"/>
+                <w:szCs w:val="16"/>
+              </w:rPr>
+              <w:t xml:space="preserve">Compétences (actifs, allégations, marketing digital)</w:t>
+            </w:r>
+          </w:p>
+        </w:tc>
+        <w:tc>
+          <w:tcPr>
+            <w:tcW w:type="dxa" w:w="964"/>
+            <w:tcBorders>
+              <w:top w:val="single" w:color="E3D6DA" w:sz="4"/>
+              <w:left w:val="single" w:color="E3D6DA" w:sz="4"/>
+              <w:bottom w:val="single" w:color="E3D6DA" w:sz="4"/>
+              <w:right w:val="single" w:color="E3D6DA" w:sz="4"/>
+            </w:tcBorders>
+            <w:tcMar>
+              <w:top w:type="dxa" w:w="70"/>
+              <w:left w:type="dxa" w:w="100"/>
+              <w:bottom w:type="dxa" w:w="70"/>
+              <w:right w:type="dxa" w:w="100"/>
+            </w:tcMar>
+            <w:vAlign w:val="top"/>
+          </w:tcPr>
+          <w:p>
+            <w:pPr>
+              <w:spacing w:after="40" w:line="252"/>
+              <w:jc w:val="center"/>
+            </w:pPr>
+            <w:r>
+              <w:rPr>
+                <w:rFonts w:ascii="Calibri" w:cs="Calibri" w:eastAsia="Calibri" w:hAnsi="Calibri"/>
+                <w:b w:val="false"/>
+                <w:bCs w:val="false"/>
+                <w:color w:val="2A1A20"/>
+                <w:sz w:val="16"/>
+                <w:szCs w:val="16"/>
+              </w:rPr>
+              <w:t xml:space="preserve">30 %</w:t>
+            </w:r>
+          </w:p>
+        </w:tc>
+        <w:tc>
+          <w:tcPr>
+            <w:tcW w:type="dxa" w:w="1205"/>
+            <w:tcBorders>
+              <w:top w:val="single" w:color="E3D6DA" w:sz="4"/>
+              <w:left w:val="single" w:color="E3D6DA" w:sz="4"/>
+              <w:bottom w:val="single" w:color="E3D6DA" w:sz="4"/>
+              <w:right w:val="single" w:color="E3D6DA" w:sz="4"/>
+            </w:tcBorders>
+            <w:tcMar>
+              <w:top w:type="dxa" w:w="70"/>
+              <w:left w:type="dxa" w:w="100"/>
+              <w:bottom w:type="dxa" w:w="70"/>
+              <w:right w:type="dxa" w:w="100"/>
+            </w:tcMar>
+            <w:vAlign w:val="top"/>
+          </w:tcPr>
+          <w:p>
+            <w:pPr>
+              <w:spacing w:after="40" w:line="252"/>
+              <w:jc w:val="center"/>
+            </w:pPr>
+            <w:r>
+              <w:rPr>
+                <w:rFonts w:ascii="Calibri" w:cs="Calibri" w:eastAsia="Calibri" w:hAnsi="Calibri"/>
+                <w:b w:val="false"/>
+                <w:bCs w:val="false"/>
+                <w:color w:val="2A1A20"/>
+                <w:sz w:val="16"/>
+                <w:szCs w:val="16"/>
+              </w:rPr>
+              <w:t xml:space="preserve">5</w:t>
+            </w:r>
+          </w:p>
+        </w:tc>
+        <w:tc>
+          <w:tcPr>
+            <w:tcW w:type="dxa" w:w="1205"/>
+            <w:tcBorders>
+              <w:top w:val="single" w:color="E3D6DA" w:sz="4"/>
+              <w:left w:val="single" w:color="E3D6DA" w:sz="4"/>
+              <w:bottom w:val="single" w:color="E3D6DA" w:sz="4"/>
+              <w:right w:val="single" w:color="E3D6DA" w:sz="4"/>
+            </w:tcBorders>
+            <w:tcMar>
+              <w:top w:type="dxa" w:w="70"/>
+              <w:left w:type="dxa" w:w="100"/>
+              <w:bottom w:type="dxa" w:w="70"/>
+              <w:right w:type="dxa" w:w="100"/>
+            </w:tcMar>
+            <w:vAlign w:val="top"/>
+          </w:tcPr>
+          <w:p>
+            <w:pPr>
+              <w:spacing w:after="40" w:line="252"/>
+              <w:jc w:val="center"/>
+            </w:pPr>
+            <w:r>
+              <w:rPr>
+                <w:rFonts w:ascii="Calibri" w:cs="Calibri" w:eastAsia="Calibri" w:hAnsi="Calibri"/>
+                <w:b w:val="false"/>
+                <w:bCs w:val="false"/>
+                <w:color w:val="2A1A20"/>
+                <w:sz w:val="16"/>
+                <w:szCs w:val="16"/>
+              </w:rPr>
+              <w:t xml:space="preserve">4</w:t>
+            </w:r>
+          </w:p>
+        </w:tc>
+        <w:tc>
+          <w:tcPr>
+            <w:tcW w:type="dxa" w:w="1205"/>
+            <w:tcBorders>
+              <w:top w:val="single" w:color="E3D6DA" w:sz="4"/>
+              <w:left w:val="single" w:color="E3D6DA" w:sz="4"/>
+              <w:bottom w:val="single" w:color="E3D6DA" w:sz="4"/>
+              <w:right w:val="single" w:color="E3D6DA" w:sz="4"/>
+            </w:tcBorders>
+            <w:tcMar>
+              <w:top w:type="dxa" w:w="70"/>
+              <w:left w:type="dxa" w:w="100"/>
+              <w:bottom w:type="dxa" w:w="70"/>
+              <w:right w:type="dxa" w:w="100"/>
+            </w:tcMar>
+            <w:vAlign w:val="top"/>
+          </w:tcPr>
+          <w:p>
+            <w:pPr>
+              <w:spacing w:after="40" w:line="252"/>
+              <w:jc w:val="center"/>
+            </w:pPr>
+            <w:r>
+              <w:rPr>
+                <w:rFonts w:ascii="Calibri" w:cs="Calibri" w:eastAsia="Calibri" w:hAnsi="Calibri"/>
+                <w:b w:val="false"/>
+                <w:bCs w:val="false"/>
+                <w:color w:val="2A1A20"/>
+                <w:sz w:val="16"/>
+                <w:szCs w:val="16"/>
+              </w:rPr>
+              <w:t xml:space="preserve">2</w:t>
+            </w:r>
+          </w:p>
+        </w:tc>
+        <w:tc>
+          <w:tcPr>
+            <w:tcW w:type="dxa" w:w="1204"/>
+            <w:tcBorders>
+              <w:top w:val="single" w:color="E3D6DA" w:sz="4"/>
+              <w:left w:val="single" w:color="E3D6DA" w:sz="4"/>
+              <w:bottom w:val="single" w:color="E3D6DA" w:sz="4"/>
+              <w:right w:val="single" w:color="E3D6DA" w:sz="4"/>
+            </w:tcBorders>
+            <w:tcMar>
+              <w:top w:type="dxa" w:w="70"/>
+              <w:left w:type="dxa" w:w="100"/>
+              <w:bottom w:type="dxa" w:w="70"/>
+              <w:right w:type="dxa" w:w="100"/>
+            </w:tcMar>
+            <w:vAlign w:val="top"/>
+          </w:tcPr>
+          <w:p>
+            <w:pPr>
+              <w:spacing w:after="40" w:line="252"/>
+              <w:jc w:val="center"/>
+            </w:pPr>
+            <w:r>
+              <w:rPr>
+                <w:rFonts w:ascii="Calibri" w:cs="Calibri" w:eastAsia="Calibri" w:hAnsi="Calibri"/>
+                <w:b w:val="false"/>
+                <w:bCs w:val="false"/>
+                <w:color w:val="2A1A20"/>
+                <w:sz w:val="16"/>
+                <w:szCs w:val="16"/>
+              </w:rPr>
+              <w:t xml:space="preserve">2</w:t>
+            </w:r>
+          </w:p>
+        </w:tc>
+      </w:tr>
+      <w:tr>
+        <w:tc>
+          <w:tcPr>
+            <w:tcW w:type="dxa" w:w="3855"/>
+            <w:tcBorders>
+              <w:top w:val="single" w:color="E3D6DA" w:sz="4"/>
+              <w:left w:val="single" w:color="E3D6DA" w:sz="4"/>
+              <w:bottom w:val="single" w:color="E3D6DA" w:sz="4"/>
+              <w:right w:val="single" w:color="E3D6DA" w:sz="4"/>
+            </w:tcBorders>
+            <w:shd w:fill="F7F2F3" w:color="auto" w:val="clear"/>
+            <w:tcMar>
+              <w:top w:type="dxa" w:w="70"/>
+              <w:left w:type="dxa" w:w="100"/>
+              <w:bottom w:type="dxa" w:w="70"/>
+              <w:right w:type="dxa" w:w="100"/>
+            </w:tcMar>
+            <w:vAlign w:val="top"/>
+          </w:tcPr>
+          <w:p>
+            <w:pPr>
+              <w:spacing w:after="40" w:line="252"/>
+              <w:jc w:val="left"/>
+            </w:pPr>
+            <w:r>
+              <w:rPr>
+                <w:rFonts w:ascii="Calibri" w:cs="Calibri" w:eastAsia="Calibri" w:hAnsi="Calibri"/>
+                <w:b/>
+                <w:bCs/>
+                <w:color w:val="2A1A20"/>
+                <w:sz w:val="16"/>
+                <w:szCs w:val="16"/>
+              </w:rPr>
+              <w:t xml:space="preserve">Accès au canal sans prescripteur</w:t>
+            </w:r>
+          </w:p>
+        </w:tc>
+        <w:tc>
+          <w:tcPr>
+            <w:tcW w:type="dxa" w:w="964"/>
+            <w:tcBorders>
+              <w:top w:val="single" w:color="E3D6DA" w:sz="4"/>
+              <w:left w:val="single" w:color="E3D6DA" w:sz="4"/>
+              <w:bottom w:val="single" w:color="E3D6DA" w:sz="4"/>
+              <w:right w:val="single" w:color="E3D6DA" w:sz="4"/>
+            </w:tcBorders>
+            <w:tcMar>
+              <w:top w:type="dxa" w:w="70"/>
+              <w:left w:type="dxa" w:w="100"/>
+              <w:bottom w:type="dxa" w:w="70"/>
+              <w:right w:type="dxa" w:w="100"/>
+            </w:tcMar>
+            <w:vAlign w:val="top"/>
+          </w:tcPr>
+          <w:p>
+            <w:pPr>
+              <w:spacing w:after="40" w:line="252"/>
+              <w:jc w:val="center"/>
+            </w:pPr>
+            <w:r>
+              <w:rPr>
+                <w:rFonts w:ascii="Calibri" w:cs="Calibri" w:eastAsia="Calibri" w:hAnsi="Calibri"/>
+                <w:b w:val="false"/>
+                <w:bCs w:val="false"/>
+                <w:color w:val="2A1A20"/>
+                <w:sz w:val="16"/>
+                <w:szCs w:val="16"/>
+              </w:rPr>
+              <w:t xml:space="preserve">30 %</w:t>
+            </w:r>
+          </w:p>
+        </w:tc>
+        <w:tc>
+          <w:tcPr>
+            <w:tcW w:type="dxa" w:w="1205"/>
+            <w:tcBorders>
+              <w:top w:val="single" w:color="E3D6DA" w:sz="4"/>
+              <w:left w:val="single" w:color="E3D6DA" w:sz="4"/>
+              <w:bottom w:val="single" w:color="E3D6DA" w:sz="4"/>
+              <w:right w:val="single" w:color="E3D6DA" w:sz="4"/>
+            </w:tcBorders>
+            <w:tcMar>
+              <w:top w:type="dxa" w:w="70"/>
+              <w:left w:type="dxa" w:w="100"/>
+              <w:bottom w:type="dxa" w:w="70"/>
+              <w:right w:type="dxa" w:w="100"/>
+            </w:tcMar>
+            <w:vAlign w:val="top"/>
+          </w:tcPr>
+          <w:p>
+            <w:pPr>
+              <w:spacing w:after="40" w:line="252"/>
+              <w:jc w:val="center"/>
+            </w:pPr>
+            <w:r>
+              <w:rPr>
+                <w:rFonts w:ascii="Calibri" w:cs="Calibri" w:eastAsia="Calibri" w:hAnsi="Calibri"/>
+                <w:b w:val="false"/>
+                <w:bCs w:val="false"/>
+                <w:color w:val="2A1A20"/>
+                <w:sz w:val="16"/>
+                <w:szCs w:val="16"/>
+              </w:rPr>
+              <w:t xml:space="preserve">4</w:t>
+            </w:r>
+          </w:p>
+        </w:tc>
+        <w:tc>
+          <w:tcPr>
+            <w:tcW w:type="dxa" w:w="1205"/>
+            <w:tcBorders>
+              <w:top w:val="single" w:color="E3D6DA" w:sz="4"/>
+              <w:left w:val="single" w:color="E3D6DA" w:sz="4"/>
+              <w:bottom w:val="single" w:color="E3D6DA" w:sz="4"/>
+              <w:right w:val="single" w:color="E3D6DA" w:sz="4"/>
+            </w:tcBorders>
+            <w:tcMar>
+              <w:top w:type="dxa" w:w="70"/>
+              <w:left w:type="dxa" w:w="100"/>
+              <w:bottom w:type="dxa" w:w="70"/>
+              <w:right w:type="dxa" w:w="100"/>
+            </w:tcMar>
+            <w:vAlign w:val="top"/>
+          </w:tcPr>
+          <w:p>
+            <w:pPr>
+              <w:spacing w:after="40" w:line="252"/>
+              <w:jc w:val="center"/>
+            </w:pPr>
+            <w:r>
+              <w:rPr>
+                <w:rFonts w:ascii="Calibri" w:cs="Calibri" w:eastAsia="Calibri" w:hAnsi="Calibri"/>
+                <w:b w:val="false"/>
+                <w:bCs w:val="false"/>
+                <w:color w:val="2A1A20"/>
+                <w:sz w:val="16"/>
+                <w:szCs w:val="16"/>
+              </w:rPr>
+              <w:t xml:space="preserve">4</w:t>
+            </w:r>
+          </w:p>
+        </w:tc>
+        <w:tc>
+          <w:tcPr>
+            <w:tcW w:type="dxa" w:w="1205"/>
+            <w:tcBorders>
+              <w:top w:val="single" w:color="E3D6DA" w:sz="4"/>
+              <w:left w:val="single" w:color="E3D6DA" w:sz="4"/>
+              <w:bottom w:val="single" w:color="E3D6DA" w:sz="4"/>
+              <w:right w:val="single" w:color="E3D6DA" w:sz="4"/>
+            </w:tcBorders>
+            <w:tcMar>
+              <w:top w:type="dxa" w:w="70"/>
+              <w:left w:type="dxa" w:w="100"/>
+              <w:bottom w:type="dxa" w:w="70"/>
+              <w:right w:type="dxa" w:w="100"/>
+            </w:tcMar>
+            <w:vAlign w:val="top"/>
+          </w:tcPr>
+          <w:p>
+            <w:pPr>
+              <w:spacing w:after="40" w:line="252"/>
+              <w:jc w:val="center"/>
+            </w:pPr>
+            <w:r>
+              <w:rPr>
+                <w:rFonts w:ascii="Calibri" w:cs="Calibri" w:eastAsia="Calibri" w:hAnsi="Calibri"/>
+                <w:b w:val="false"/>
+                <w:bCs w:val="false"/>
+                <w:color w:val="2A1A20"/>
+                <w:sz w:val="16"/>
+                <w:szCs w:val="16"/>
+              </w:rPr>
+              <w:t xml:space="preserve">2</w:t>
+            </w:r>
+          </w:p>
+        </w:tc>
+        <w:tc>
+          <w:tcPr>
+            <w:tcW w:type="dxa" w:w="1204"/>
+            <w:tcBorders>
+              <w:top w:val="single" w:color="E3D6DA" w:sz="4"/>
+              <w:left w:val="single" w:color="E3D6DA" w:sz="4"/>
+              <w:bottom w:val="single" w:color="E3D6DA" w:sz="4"/>
+              <w:right w:val="single" w:color="E3D6DA" w:sz="4"/>
+            </w:tcBorders>
+            <w:tcMar>
+              <w:top w:type="dxa" w:w="70"/>
+              <w:left w:type="dxa" w:w="100"/>
+              <w:bottom w:type="dxa" w:w="70"/>
+              <w:right w:type="dxa" w:w="100"/>
+            </w:tcMar>
+            <w:vAlign w:val="top"/>
+          </w:tcPr>
+          <w:p>
+            <w:pPr>
+              <w:spacing w:after="40" w:line="252"/>
+              <w:jc w:val="center"/>
+            </w:pPr>
+            <w:r>
+              <w:rPr>
+                <w:rFonts w:ascii="Calibri" w:cs="Calibri" w:eastAsia="Calibri" w:hAnsi="Calibri"/>
+                <w:b w:val="false"/>
+                <w:bCs w:val="false"/>
+                <w:color w:val="2A1A20"/>
+                <w:sz w:val="16"/>
+                <w:szCs w:val="16"/>
+              </w:rPr>
+              <w:t xml:space="preserve">1</w:t>
+            </w:r>
+          </w:p>
+        </w:tc>
+      </w:tr>
+      <w:tr>
+        <w:tc>
+          <w:tcPr>
+            <w:tcW w:type="dxa" w:w="3855"/>
+            <w:tcBorders>
+              <w:top w:val="single" w:color="E3D6DA" w:sz="4"/>
+              <w:left w:val="single" w:color="E3D6DA" w:sz="4"/>
+              <w:bottom w:val="single" w:color="E3D6DA" w:sz="4"/>
+              <w:right w:val="single" w:color="E3D6DA" w:sz="4"/>
+            </w:tcBorders>
+            <w:shd w:fill="F7F2F3" w:color="auto" w:val="clear"/>
+            <w:tcMar>
+              <w:top w:type="dxa" w:w="70"/>
+              <w:left w:type="dxa" w:w="100"/>
+              <w:bottom w:type="dxa" w:w="70"/>
+              <w:right w:type="dxa" w:w="100"/>
+            </w:tcMar>
+            <w:vAlign w:val="top"/>
+          </w:tcPr>
+          <w:p>
+            <w:pPr>
+              <w:spacing w:after="40" w:line="252"/>
+              <w:jc w:val="left"/>
+            </w:pPr>
+            <w:r>
+              <w:rPr>
+                <w:rFonts w:ascii="Calibri" w:cs="Calibri" w:eastAsia="Calibri" w:hAnsi="Calibri"/>
+                <w:b/>
+                <w:bCs/>
+                <w:color w:val="2A1A20"/>
+                <w:sz w:val="16"/>
+                <w:szCs w:val="16"/>
+              </w:rPr>
+              <w:t xml:space="preserve">Crédibilité / légitimité auprès de la cible</w:t>
+            </w:r>
+          </w:p>
+        </w:tc>
+        <w:tc>
+          <w:tcPr>
+            <w:tcW w:type="dxa" w:w="964"/>
+            <w:tcBorders>
+              <w:top w:val="single" w:color="E3D6DA" w:sz="4"/>
+              <w:left w:val="single" w:color="E3D6DA" w:sz="4"/>
+              <w:bottom w:val="single" w:color="E3D6DA" w:sz="4"/>
+              <w:right w:val="single" w:color="E3D6DA" w:sz="4"/>
+            </w:tcBorders>
+            <w:tcMar>
+              <w:top w:type="dxa" w:w="70"/>
+              <w:left w:type="dxa" w:w="100"/>
+              <w:bottom w:type="dxa" w:w="70"/>
+              <w:right w:type="dxa" w:w="100"/>
+            </w:tcMar>
+            <w:vAlign w:val="top"/>
+          </w:tcPr>
+          <w:p>
+            <w:pPr>
+              <w:spacing w:after="40" w:line="252"/>
+              <w:jc w:val="center"/>
+            </w:pPr>
+            <w:r>
+              <w:rPr>
+                <w:rFonts w:ascii="Calibri" w:cs="Calibri" w:eastAsia="Calibri" w:hAnsi="Calibri"/>
+                <w:b w:val="false"/>
+                <w:bCs w:val="false"/>
+                <w:color w:val="2A1A20"/>
+                <w:sz w:val="16"/>
+                <w:szCs w:val="16"/>
+              </w:rPr>
+              <w:t xml:space="preserve">20 %</w:t>
+            </w:r>
+          </w:p>
+        </w:tc>
+        <w:tc>
+          <w:tcPr>
+            <w:tcW w:type="dxa" w:w="1205"/>
+            <w:tcBorders>
+              <w:top w:val="single" w:color="E3D6DA" w:sz="4"/>
+              <w:left w:val="single" w:color="E3D6DA" w:sz="4"/>
+              <w:bottom w:val="single" w:color="E3D6DA" w:sz="4"/>
+              <w:right w:val="single" w:color="E3D6DA" w:sz="4"/>
+            </w:tcBorders>
+            <w:tcMar>
+              <w:top w:type="dxa" w:w="70"/>
+              <w:left w:type="dxa" w:w="100"/>
+              <w:bottom w:type="dxa" w:w="70"/>
+              <w:right w:type="dxa" w:w="100"/>
+            </w:tcMar>
+            <w:vAlign w:val="top"/>
+          </w:tcPr>
+          <w:p>
+            <w:pPr>
+              <w:spacing w:after="40" w:line="252"/>
+              <w:jc w:val="center"/>
+            </w:pPr>
+            <w:r>
+              <w:rPr>
+                <w:rFonts w:ascii="Calibri" w:cs="Calibri" w:eastAsia="Calibri" w:hAnsi="Calibri"/>
+                <w:b w:val="false"/>
+                <w:bCs w:val="false"/>
+                <w:color w:val="2A1A20"/>
+                <w:sz w:val="16"/>
+                <w:szCs w:val="16"/>
+              </w:rPr>
+              <w:t xml:space="preserve">4</w:t>
+            </w:r>
+          </w:p>
+        </w:tc>
+        <w:tc>
+          <w:tcPr>
+            <w:tcW w:type="dxa" w:w="1205"/>
+            <w:tcBorders>
+              <w:top w:val="single" w:color="E3D6DA" w:sz="4"/>
+              <w:left w:val="single" w:color="E3D6DA" w:sz="4"/>
+              <w:bottom w:val="single" w:color="E3D6DA" w:sz="4"/>
+              <w:right w:val="single" w:color="E3D6DA" w:sz="4"/>
+            </w:tcBorders>
+            <w:tcMar>
+              <w:top w:type="dxa" w:w="70"/>
+              <w:left w:type="dxa" w:w="100"/>
+              <w:bottom w:type="dxa" w:w="70"/>
+              <w:right w:type="dxa" w:w="100"/>
+            </w:tcMar>
+            <w:vAlign w:val="top"/>
+          </w:tcPr>
+          <w:p>
+            <w:pPr>
+              <w:spacing w:after="40" w:line="252"/>
+              <w:jc w:val="center"/>
+            </w:pPr>
+            <w:r>
+              <w:rPr>
+                <w:rFonts w:ascii="Calibri" w:cs="Calibri" w:eastAsia="Calibri" w:hAnsi="Calibri"/>
+                <w:b w:val="false"/>
+                <w:bCs w:val="false"/>
+                <w:color w:val="2A1A20"/>
+                <w:sz w:val="16"/>
+                <w:szCs w:val="16"/>
+              </w:rPr>
+              <w:t xml:space="preserve">2</w:t>
+            </w:r>
+          </w:p>
+        </w:tc>
+        <w:tc>
+          <w:tcPr>
+            <w:tcW w:type="dxa" w:w="1205"/>
+            <w:tcBorders>
+              <w:top w:val="single" w:color="E3D6DA" w:sz="4"/>
+              <w:left w:val="single" w:color="E3D6DA" w:sz="4"/>
+              <w:bottom w:val="single" w:color="E3D6DA" w:sz="4"/>
+              <w:right w:val="single" w:color="E3D6DA" w:sz="4"/>
+            </w:tcBorders>
+            <w:tcMar>
+              <w:top w:type="dxa" w:w="70"/>
+              <w:left w:type="dxa" w:w="100"/>
+              <w:bottom w:type="dxa" w:w="70"/>
+              <w:right w:type="dxa" w:w="100"/>
+            </w:tcMar>
+            <w:vAlign w:val="top"/>
+          </w:tcPr>
+          <w:p>
+            <w:pPr>
+              <w:spacing w:after="40" w:line="252"/>
+              <w:jc w:val="center"/>
+            </w:pPr>
+            <w:r>
+              <w:rPr>
+                <w:rFonts w:ascii="Calibri" w:cs="Calibri" w:eastAsia="Calibri" w:hAnsi="Calibri"/>
+                <w:b w:val="false"/>
+                <w:bCs w:val="false"/>
+                <w:color w:val="2A1A20"/>
+                <w:sz w:val="16"/>
+                <w:szCs w:val="16"/>
+              </w:rPr>
+              <w:t xml:space="preserve">1</w:t>
+            </w:r>
+          </w:p>
+        </w:tc>
+        <w:tc>
+          <w:tcPr>
+            <w:tcW w:type="dxa" w:w="1204"/>
+            <w:tcBorders>
+              <w:top w:val="single" w:color="E3D6DA" w:sz="4"/>
+              <w:left w:val="single" w:color="E3D6DA" w:sz="4"/>
+              <w:bottom w:val="single" w:color="E3D6DA" w:sz="4"/>
+              <w:right w:val="single" w:color="E3D6DA" w:sz="4"/>
+            </w:tcBorders>
+            <w:tcMar>
+              <w:top w:type="dxa" w:w="70"/>
+              <w:left w:type="dxa" w:w="100"/>
+              <w:bottom w:type="dxa" w:w="70"/>
+              <w:right w:type="dxa" w:w="100"/>
+            </w:tcMar>
+            <w:vAlign w:val="top"/>
+          </w:tcPr>
+          <w:p>
+            <w:pPr>
+              <w:spacing w:after="40" w:line="252"/>
+              <w:jc w:val="center"/>
+            </w:pPr>
+            <w:r>
+              <w:rPr>
+                <w:rFonts w:ascii="Calibri" w:cs="Calibri" w:eastAsia="Calibri" w:hAnsi="Calibri"/>
+                <w:b w:val="false"/>
+                <w:bCs w:val="false"/>
+                <w:color w:val="2A1A20"/>
+                <w:sz w:val="16"/>
+                <w:szCs w:val="16"/>
+              </w:rPr>
+              <w:t xml:space="preserve">2</w:t>
+            </w:r>
+          </w:p>
+        </w:tc>
+      </w:tr>
+      <w:tr>
+        <w:tc>
+          <w:tcPr>
+            <w:tcW w:type="dxa" w:w="3855"/>
+            <w:tcBorders>
+              <w:top w:val="single" w:color="E3D6DA" w:sz="4"/>
+              <w:left w:val="single" w:color="E3D6DA" w:sz="4"/>
+              <w:bottom w:val="single" w:color="E3D6DA" w:sz="4"/>
+              <w:right w:val="single" w:color="E3D6DA" w:sz="4"/>
+            </w:tcBorders>
+            <w:shd w:fill="F7F2F3" w:color="auto" w:val="clear"/>
+            <w:tcMar>
+              <w:top w:type="dxa" w:w="70"/>
+              <w:left w:type="dxa" w:w="100"/>
+              <w:bottom w:type="dxa" w:w="70"/>
+              <w:right w:type="dxa" w:w="100"/>
+            </w:tcMar>
+            <w:vAlign w:val="top"/>
+          </w:tcPr>
+          <w:p>
+            <w:pPr>
+              <w:spacing w:after="40" w:line="252"/>
+              <w:jc w:val="left"/>
+            </w:pPr>
+            <w:r>
+              <w:rPr>
+                <w:rFonts w:ascii="Calibri" w:cs="Calibri" w:eastAsia="Calibri" w:hAnsi="Calibri"/>
+                <w:b/>
+                <w:bCs/>
+                <w:color w:val="2A1A20"/>
+                <w:sz w:val="16"/>
+                <w:szCs w:val="16"/>
+              </w:rPr>
+              <w:t xml:space="preserve">Adéquation avec les ressources de départ</w:t>
+            </w:r>
+          </w:p>
+        </w:tc>
+        <w:tc>
+          <w:tcPr>
+            <w:tcW w:type="dxa" w:w="964"/>
+            <w:tcBorders>
+              <w:top w:val="single" w:color="E3D6DA" w:sz="4"/>
+              <w:left w:val="single" w:color="E3D6DA" w:sz="4"/>
+              <w:bottom w:val="single" w:color="E3D6DA" w:sz="4"/>
+              <w:right w:val="single" w:color="E3D6DA" w:sz="4"/>
+            </w:tcBorders>
+            <w:tcMar>
+              <w:top w:type="dxa" w:w="70"/>
+              <w:left w:type="dxa" w:w="100"/>
+              <w:bottom w:type="dxa" w:w="70"/>
+              <w:right w:type="dxa" w:w="100"/>
+            </w:tcMar>
+            <w:vAlign w:val="top"/>
+          </w:tcPr>
+          <w:p>
+            <w:pPr>
+              <w:spacing w:after="40" w:line="252"/>
+              <w:jc w:val="center"/>
+            </w:pPr>
+            <w:r>
+              <w:rPr>
+                <w:rFonts w:ascii="Calibri" w:cs="Calibri" w:eastAsia="Calibri" w:hAnsi="Calibri"/>
+                <w:b w:val="false"/>
+                <w:bCs w:val="false"/>
+                <w:color w:val="2A1A20"/>
+                <w:sz w:val="16"/>
+                <w:szCs w:val="16"/>
+              </w:rPr>
+              <w:t xml:space="preserve">20 %</w:t>
+            </w:r>
+          </w:p>
+        </w:tc>
+        <w:tc>
+          <w:tcPr>
+            <w:tcW w:type="dxa" w:w="1205"/>
+            <w:tcBorders>
+              <w:top w:val="single" w:color="E3D6DA" w:sz="4"/>
+              <w:left w:val="single" w:color="E3D6DA" w:sz="4"/>
+              <w:bottom w:val="single" w:color="E3D6DA" w:sz="4"/>
+              <w:right w:val="single" w:color="E3D6DA" w:sz="4"/>
+            </w:tcBorders>
+            <w:tcMar>
+              <w:top w:type="dxa" w:w="70"/>
+              <w:left w:type="dxa" w:w="100"/>
+              <w:bottom w:type="dxa" w:w="70"/>
+              <w:right w:type="dxa" w:w="100"/>
+            </w:tcMar>
+            <w:vAlign w:val="top"/>
+          </w:tcPr>
+          <w:p>
+            <w:pPr>
+              <w:spacing w:after="40" w:line="252"/>
+              <w:jc w:val="center"/>
+            </w:pPr>
+            <w:r>
+              <w:rPr>
+                <w:rFonts w:ascii="Calibri" w:cs="Calibri" w:eastAsia="Calibri" w:hAnsi="Calibri"/>
+                <w:b w:val="false"/>
+                <w:bCs w:val="false"/>
+                <w:color w:val="2A1A20"/>
+                <w:sz w:val="16"/>
+                <w:szCs w:val="16"/>
+              </w:rPr>
+              <w:t xml:space="preserve">3</w:t>
+            </w:r>
+          </w:p>
+        </w:tc>
+        <w:tc>
+          <w:tcPr>
+            <w:tcW w:type="dxa" w:w="1205"/>
+            <w:tcBorders>
+              <w:top w:val="single" w:color="E3D6DA" w:sz="4"/>
+              <w:left w:val="single" w:color="E3D6DA" w:sz="4"/>
+              <w:bottom w:val="single" w:color="E3D6DA" w:sz="4"/>
+              <w:right w:val="single" w:color="E3D6DA" w:sz="4"/>
+            </w:tcBorders>
+            <w:tcMar>
+              <w:top w:type="dxa" w:w="70"/>
+              <w:left w:type="dxa" w:w="100"/>
+              <w:bottom w:type="dxa" w:w="70"/>
+              <w:right w:type="dxa" w:w="100"/>
+            </w:tcMar>
+            <w:vAlign w:val="top"/>
+          </w:tcPr>
+          <w:p>
+            <w:pPr>
+              <w:spacing w:after="40" w:line="252"/>
+              <w:jc w:val="center"/>
+            </w:pPr>
+            <w:r>
+              <w:rPr>
+                <w:rFonts w:ascii="Calibri" w:cs="Calibri" w:eastAsia="Calibri" w:hAnsi="Calibri"/>
+                <w:b w:val="false"/>
+                <w:bCs w:val="false"/>
+                <w:color w:val="2A1A20"/>
+                <w:sz w:val="16"/>
+                <w:szCs w:val="16"/>
+              </w:rPr>
+              <w:t xml:space="preserve">4</w:t>
+            </w:r>
+          </w:p>
+        </w:tc>
+        <w:tc>
+          <w:tcPr>
+            <w:tcW w:type="dxa" w:w="1205"/>
+            <w:tcBorders>
+              <w:top w:val="single" w:color="E3D6DA" w:sz="4"/>
+              <w:left w:val="single" w:color="E3D6DA" w:sz="4"/>
+              <w:bottom w:val="single" w:color="E3D6DA" w:sz="4"/>
+              <w:right w:val="single" w:color="E3D6DA" w:sz="4"/>
+            </w:tcBorders>
+            <w:tcMar>
+              <w:top w:type="dxa" w:w="70"/>
+              <w:left w:type="dxa" w:w="100"/>
+              <w:bottom w:type="dxa" w:w="70"/>
+              <w:right w:type="dxa" w:w="100"/>
+            </w:tcMar>
+            <w:vAlign w:val="top"/>
+          </w:tcPr>
+          <w:p>
+            <w:pPr>
+              <w:spacing w:after="40" w:line="252"/>
+              <w:jc w:val="center"/>
+            </w:pPr>
+            <w:r>
+              <w:rPr>
+                <w:rFonts w:ascii="Calibri" w:cs="Calibri" w:eastAsia="Calibri" w:hAnsi="Calibri"/>
+                <w:b w:val="false"/>
+                <w:bCs w:val="false"/>
+                <w:color w:val="2A1A20"/>
+                <w:sz w:val="16"/>
+                <w:szCs w:val="16"/>
+              </w:rPr>
+              <w:t xml:space="preserve">2</w:t>
+            </w:r>
+          </w:p>
+        </w:tc>
+        <w:tc>
+          <w:tcPr>
+            <w:tcW w:type="dxa" w:w="1204"/>
+            <w:tcBorders>
+              <w:top w:val="single" w:color="E3D6DA" w:sz="4"/>
+              <w:left w:val="single" w:color="E3D6DA" w:sz="4"/>
+              <w:bottom w:val="single" w:color="E3D6DA" w:sz="4"/>
+              <w:right w:val="single" w:color="E3D6DA" w:sz="4"/>
+            </w:tcBorders>
+            <w:tcMar>
+              <w:top w:type="dxa" w:w="70"/>
+              <w:left w:type="dxa" w:w="100"/>
+              <w:bottom w:type="dxa" w:w="70"/>
+              <w:right w:type="dxa" w:w="100"/>
+            </w:tcMar>
+            <w:vAlign w:val="top"/>
+          </w:tcPr>
+          <w:p>
+            <w:pPr>
+              <w:spacing w:after="40" w:line="252"/>
+              <w:jc w:val="center"/>
+            </w:pPr>
+            <w:r>
+              <w:rPr>
+                <w:rFonts w:ascii="Calibri" w:cs="Calibri" w:eastAsia="Calibri" w:hAnsi="Calibri"/>
+                <w:b w:val="false"/>
+                <w:bCs w:val="false"/>
+                <w:color w:val="2A1A20"/>
+                <w:sz w:val="16"/>
+                <w:szCs w:val="16"/>
+              </w:rPr>
+              <w:t xml:space="preserve">2</w:t>
+            </w:r>
+          </w:p>
+        </w:tc>
+      </w:tr>
+      <w:tr>
+        <w:tc>
+          <w:tcPr>
+            <w:tcW w:type="dxa" w:w="3855"/>
+            <w:tcBorders>
+              <w:top w:val="single" w:color="E3D6DA" w:sz="4"/>
+              <w:left w:val="single" w:color="E3D6DA" w:sz="4"/>
+              <w:bottom w:val="single" w:color="E3D6DA" w:sz="4"/>
+              <w:right w:val="single" w:color="E3D6DA" w:sz="4"/>
+            </w:tcBorders>
+            <w:shd w:fill="F7F2F3" w:color="auto" w:val="clear"/>
+            <w:tcMar>
+              <w:top w:type="dxa" w:w="70"/>
+              <w:left w:type="dxa" w:w="100"/>
+              <w:bottom w:type="dxa" w:w="70"/>
+              <w:right w:type="dxa" w:w="100"/>
+            </w:tcMar>
+            <w:vAlign w:val="top"/>
+          </w:tcPr>
+          <w:p>
+            <w:pPr>
+              <w:spacing w:after="40" w:line="252"/>
+              <w:jc w:val="left"/>
+            </w:pPr>
+            <w:r>
+              <w:rPr>
+                <w:rFonts w:ascii="Calibri" w:cs="Calibri" w:eastAsia="Calibri" w:hAnsi="Calibri"/>
+                <w:b/>
+                <w:bCs/>
+                <w:color w:val="2A1A20"/>
+                <w:sz w:val="16"/>
+                <w:szCs w:val="16"/>
+              </w:rPr>
+              <w:t xml:space="preserve">Note d'atouts / 5</w:t>
+            </w:r>
+          </w:p>
+        </w:tc>
+        <w:tc>
+          <w:tcPr>
+            <w:tcW w:type="dxa" w:w="964"/>
+            <w:tcBorders>
+              <w:top w:val="single" w:color="E3D6DA" w:sz="4"/>
+              <w:left w:val="single" w:color="E3D6DA" w:sz="4"/>
+              <w:bottom w:val="single" w:color="E3D6DA" w:sz="4"/>
+              <w:right w:val="single" w:color="E3D6DA" w:sz="4"/>
+            </w:tcBorders>
+            <w:tcMar>
+              <w:top w:type="dxa" w:w="70"/>
+              <w:left w:type="dxa" w:w="100"/>
+              <w:bottom w:type="dxa" w:w="70"/>
+              <w:right w:type="dxa" w:w="100"/>
+            </w:tcMar>
+            <w:vAlign w:val="top"/>
+          </w:tcPr>
+          <w:p>
+            <w:pPr>
+              <w:spacing w:after="40" w:line="252"/>
+              <w:jc w:val="center"/>
+            </w:pPr>
+            <w:r>
+              <w:rPr>
+                <w:rFonts w:ascii="Calibri" w:cs="Calibri" w:eastAsia="Calibri" w:hAnsi="Calibri"/>
+                <w:b w:val="false"/>
+                <w:bCs w:val="false"/>
+                <w:color w:val="2A1A20"/>
+                <w:sz w:val="16"/>
+                <w:szCs w:val="16"/>
+              </w:rPr>
+              <w:t xml:space="preserve">100 %</w:t>
+            </w:r>
+          </w:p>
+        </w:tc>
+        <w:tc>
+          <w:tcPr>
+            <w:tcW w:type="dxa" w:w="1205"/>
+            <w:tcBorders>
+              <w:top w:val="single" w:color="E3D6DA" w:sz="4"/>
+              <w:left w:val="single" w:color="E3D6DA" w:sz="4"/>
+              <w:bottom w:val="single" w:color="E3D6DA" w:sz="4"/>
+              <w:right w:val="single" w:color="E3D6DA" w:sz="4"/>
+            </w:tcBorders>
+            <w:tcMar>
+              <w:top w:type="dxa" w:w="70"/>
+              <w:left w:type="dxa" w:w="100"/>
+              <w:bottom w:type="dxa" w:w="70"/>
+              <w:right w:type="dxa" w:w="100"/>
+            </w:tcMar>
+            <w:vAlign w:val="top"/>
+          </w:tcPr>
+          <w:p>
+            <w:pPr>
+              <w:spacing w:after="40" w:line="252"/>
+              <w:jc w:val="center"/>
+            </w:pPr>
+            <w:r>
+              <w:rPr>
+                <w:rFonts w:ascii="Calibri" w:cs="Calibri" w:eastAsia="Calibri" w:hAnsi="Calibri"/>
+                <w:b/>
+                <w:bCs/>
+                <w:color w:val="2A1A20"/>
+                <w:sz w:val="16"/>
+                <w:szCs w:val="16"/>
+              </w:rPr>
+              <w:t xml:space="preserve">4,10</w:t>
+            </w:r>
+          </w:p>
+        </w:tc>
+        <w:tc>
+          <w:tcPr>
+            <w:tcW w:type="dxa" w:w="1205"/>
+            <w:tcBorders>
+              <w:top w:val="single" w:color="E3D6DA" w:sz="4"/>
+              <w:left w:val="single" w:color="E3D6DA" w:sz="4"/>
+              <w:bottom w:val="single" w:color="E3D6DA" w:sz="4"/>
+              <w:right w:val="single" w:color="E3D6DA" w:sz="4"/>
+            </w:tcBorders>
+            <w:tcMar>
+              <w:top w:type="dxa" w:w="70"/>
+              <w:left w:type="dxa" w:w="100"/>
+              <w:bottom w:type="dxa" w:w="70"/>
+              <w:right w:type="dxa" w:w="100"/>
+            </w:tcMar>
+            <w:vAlign w:val="top"/>
+          </w:tcPr>
+          <w:p>
+            <w:pPr>
+              <w:spacing w:after="40" w:line="252"/>
+              <w:jc w:val="center"/>
+            </w:pPr>
+            <w:r>
+              <w:rPr>
+                <w:rFonts w:ascii="Calibri" w:cs="Calibri" w:eastAsia="Calibri" w:hAnsi="Calibri"/>
+                <w:b/>
+                <w:bCs/>
+                <w:color w:val="2A1A20"/>
+                <w:sz w:val="16"/>
+                <w:szCs w:val="16"/>
+              </w:rPr>
+              <w:t xml:space="preserve">3,60</w:t>
+            </w:r>
+          </w:p>
+        </w:tc>
+        <w:tc>
+          <w:tcPr>
+            <w:tcW w:type="dxa" w:w="1205"/>
+            <w:tcBorders>
+              <w:top w:val="single" w:color="E3D6DA" w:sz="4"/>
+              <w:left w:val="single" w:color="E3D6DA" w:sz="4"/>
+              <w:bottom w:val="single" w:color="E3D6DA" w:sz="4"/>
+              <w:right w:val="single" w:color="E3D6DA" w:sz="4"/>
+            </w:tcBorders>
+            <w:tcMar>
+              <w:top w:type="dxa" w:w="70"/>
+              <w:left w:type="dxa" w:w="100"/>
+              <w:bottom w:type="dxa" w:w="70"/>
+              <w:right w:type="dxa" w:w="100"/>
+            </w:tcMar>
+            <w:vAlign w:val="top"/>
+          </w:tcPr>
+          <w:p>
+            <w:pPr>
+              <w:spacing w:after="40" w:line="252"/>
+              <w:jc w:val="center"/>
+            </w:pPr>
+            <w:r>
+              <w:rPr>
+                <w:rFonts w:ascii="Calibri" w:cs="Calibri" w:eastAsia="Calibri" w:hAnsi="Calibri"/>
+                <w:b/>
+                <w:bCs/>
+                <w:color w:val="2A1A20"/>
+                <w:sz w:val="16"/>
+                <w:szCs w:val="16"/>
+              </w:rPr>
+              <w:t xml:space="preserve">1,80</w:t>
+            </w:r>
+          </w:p>
+        </w:tc>
+        <w:tc>
+          <w:tcPr>
+            <w:tcW w:type="dxa" w:w="1204"/>
+            <w:tcBorders>
+              <w:top w:val="single" w:color="E3D6DA" w:sz="4"/>
+              <w:left w:val="single" w:color="E3D6DA" w:sz="4"/>
+              <w:bottom w:val="single" w:color="E3D6DA" w:sz="4"/>
+              <w:right w:val="single" w:color="E3D6DA" w:sz="4"/>
+            </w:tcBorders>
+            <w:tcMar>
+              <w:top w:type="dxa" w:w="70"/>
+              <w:left w:type="dxa" w:w="100"/>
+              <w:bottom w:type="dxa" w:w="70"/>
+              <w:right w:type="dxa" w:w="100"/>
+            </w:tcMar>
+            <w:vAlign w:val="top"/>
+          </w:tcPr>
+          <w:p>
+            <w:pPr>
+              <w:spacing w:after="40" w:line="252"/>
+              <w:jc w:val="center"/>
+            </w:pPr>
+            <w:r>
+              <w:rPr>
+                <w:rFonts w:ascii="Calibri" w:cs="Calibri" w:eastAsia="Calibri" w:hAnsi="Calibri"/>
+                <w:b/>
+                <w:bCs/>
+                <w:color w:val="2A1A20"/>
+                <w:sz w:val="16"/>
+                <w:szCs w:val="16"/>
+              </w:rPr>
+              <w:t xml:space="preserve">1,70</w:t>
+            </w:r>
+          </w:p>
+        </w:tc>
+      </w:tr>
+    </w:tbl>
+    <w:p>
+      <w:pPr>
+        <w:spacing w:after="80"/>
+      </w:pPr>
+    </w:p>
+    <w:p>
+      <w:pPr>
+        <w:spacing w:after="200" w:before="60"/>
+        <w:jc w:val="center"/>
+      </w:pPr>
+      <w:r>
+        <w:rPr>
+          <w:rFonts w:ascii="Calibri" w:cs="Calibri" w:eastAsia="Calibri" w:hAnsi="Calibri"/>
+          <w:i/>
+          <w:iCs/>
+          <w:color w:val="6E5F65"/>
+          <w:sz w:val="17"/>
+          <w:szCs w:val="17"/>
+        </w:rPr>
+        <w:t xml:space="preserve">Note = somme des (note × poids). Lecture : 1 à 2,3 faible ; 2,3 à 3,7 moyenne ; 3,7 à 5 forte. Notes estimées à partir des données de marché citées et de mon diagnostic interne.</w:t>
+      </w:r>
     </w:p>
     <w:p>
       <w:pPr>

</xml_diff>

<commit_message>
Livrable : notation des DAS sur 10
Co-Authored-By: Claude Opus 5.5 <noreply@anthropic.com>
Claude-Session: https://claude.ai/code/session_01GhVoXRgaJJbfXgbund27Nd
</commit_message>
<xml_diff>
--- a/livrables/Livrable_Marketing_Strategique_sip_lab_luna.docx
+++ b/livrables/Livrable_Marketing_Strategique_sip_lab_luna.docx
@@ -3779,7 +3779,7 @@
                 <w:sz w:val="15"/>
                 <w:szCs w:val="15"/>
               </w:rPr>
-              <w:t xml:space="preserve">MOYENNE (3,10)</w:t>
+              <w:t xml:space="preserve">MOYENNE (5,95/10)</w:t>
             </w:r>
           </w:p>
         </w:tc>
@@ -3901,7 +3901,7 @@
                 <w:sz w:val="15"/>
                 <w:szCs w:val="15"/>
               </w:rPr>
-              <w:t xml:space="preserve">FORT (4,10)</w:t>
+              <w:t xml:space="preserve">FORT (7,70/10)</w:t>
             </w:r>
           </w:p>
         </w:tc>
@@ -4056,7 +4056,7 @@
                 <w:sz w:val="15"/>
                 <w:szCs w:val="15"/>
               </w:rPr>
-              <w:t xml:space="preserve">FORTE (4,05)</w:t>
+              <w:t xml:space="preserve">FORTE (7,30/10)</w:t>
             </w:r>
           </w:p>
         </w:tc>
@@ -4173,7 +4173,7 @@
                 <w:sz w:val="15"/>
                 <w:szCs w:val="15"/>
               </w:rPr>
-              <w:t xml:space="preserve">MOYEN+ (3,60)</w:t>
+              <w:t xml:space="preserve">MOYEN+ (6,30/10)</w:t>
             </w:r>
           </w:p>
         </w:tc>
@@ -4333,7 +4333,7 @@
                 <w:sz w:val="15"/>
                 <w:szCs w:val="15"/>
               </w:rPr>
-              <w:t xml:space="preserve">MOYENNE (3,05)</w:t>
+              <w:t xml:space="preserve">MOYENNE (4,85/10)</w:t>
             </w:r>
           </w:p>
         </w:tc>
@@ -4455,7 +4455,7 @@
                 <w:sz w:val="15"/>
                 <w:szCs w:val="15"/>
               </w:rPr>
-              <w:t xml:space="preserve">FAIBLE (1,80)</w:t>
+              <w:t xml:space="preserve">FAIBLE (3,00/10)</w:t>
             </w:r>
           </w:p>
         </w:tc>
@@ -4615,7 +4615,7 @@
                 <w:sz w:val="15"/>
                 <w:szCs w:val="15"/>
               </w:rPr>
-              <w:t xml:space="preserve">MOYENNE (3,55)</w:t>
+              <w:t xml:space="preserve">MOYENNE (5,85/10)</w:t>
             </w:r>
           </w:p>
         </w:tc>
@@ -4737,7 +4737,7 @@
                 <w:sz w:val="15"/>
                 <w:szCs w:val="15"/>
               </w:rPr>
-              <w:t xml:space="preserve">FAIBLE (1,70)</w:t>
+              <w:t xml:space="preserve">FAIBLE (2,70/10)</w:t>
             </w:r>
           </w:p>
         </w:tc>
@@ -4760,7 +4760,7 @@
           <w:sz w:val="25"/>
           <w:szCs w:val="25"/>
         </w:rPr>
-        <w:t xml:space="preserve">Notation pondérée (notes de 1 à 5)</w:t>
+        <w:t xml:space="preserve">Notation pondérée (notes sur 10)</w:t>
       </w:r>
     </w:p>
     <w:tbl>
@@ -5266,7 +5266,7 @@
                 <w:sz w:val="16"/>
                 <w:szCs w:val="16"/>
               </w:rPr>
-              <w:t xml:space="preserve">5</w:t>
+              <w:t xml:space="preserve">9</w:t>
             </w:r>
           </w:p>
         </w:tc>
@@ -5301,7 +5301,7 @@
                 <w:sz w:val="16"/>
                 <w:szCs w:val="16"/>
               </w:rPr>
-              <w:t xml:space="preserve">4</w:t>
+              <w:t xml:space="preserve">7</w:t>
             </w:r>
           </w:p>
         </w:tc>
@@ -5336,7 +5336,7 @@
                 <w:sz w:val="16"/>
                 <w:szCs w:val="16"/>
               </w:rPr>
-              <w:t xml:space="preserve">3</w:t>
+              <w:t xml:space="preserve">5</w:t>
             </w:r>
           </w:p>
         </w:tc>
@@ -5371,7 +5371,7 @@
                 <w:sz w:val="16"/>
                 <w:szCs w:val="16"/>
               </w:rPr>
-              <w:t xml:space="preserve">5</w:t>
+              <w:t xml:space="preserve">8</w:t>
             </w:r>
           </w:p>
         </w:tc>
@@ -5479,7 +5479,7 @@
                 <w:sz w:val="16"/>
                 <w:szCs w:val="16"/>
               </w:rPr>
-              <w:t xml:space="preserve">3</w:t>
+              <w:t xml:space="preserve">6</w:t>
             </w:r>
           </w:p>
         </w:tc>
@@ -5514,7 +5514,7 @@
                 <w:sz w:val="16"/>
                 <w:szCs w:val="16"/>
               </w:rPr>
-              <w:t xml:space="preserve">5</w:t>
+              <w:t xml:space="preserve">9</w:t>
             </w:r>
           </w:p>
         </w:tc>
@@ -5549,7 +5549,7 @@
                 <w:sz w:val="16"/>
                 <w:szCs w:val="16"/>
               </w:rPr>
-              <w:t xml:space="preserve">4</w:t>
+              <w:t xml:space="preserve">6</w:t>
             </w:r>
           </w:p>
         </w:tc>
@@ -5584,7 +5584,7 @@
                 <w:sz w:val="16"/>
                 <w:szCs w:val="16"/>
               </w:rPr>
-              <w:t xml:space="preserve">4</w:t>
+              <w:t xml:space="preserve">7</w:t>
             </w:r>
           </w:p>
         </w:tc>
@@ -5622,7 +5622,7 @@
                 <w:sz w:val="16"/>
                 <w:szCs w:val="16"/>
               </w:rPr>
-              <w:t xml:space="preserve">Intensité concurrentielle (5 = faible)</w:t>
+              <w:t xml:space="preserve">Intensité concurrentielle (10 = faible)</w:t>
             </w:r>
           </w:p>
         </w:tc>
@@ -5692,7 +5692,7 @@
                 <w:sz w:val="16"/>
                 <w:szCs w:val="16"/>
               </w:rPr>
-              <w:t xml:space="preserve">1</w:t>
+              <w:t xml:space="preserve">2</w:t>
             </w:r>
           </w:p>
         </w:tc>
@@ -5727,7 +5727,7 @@
                 <w:sz w:val="16"/>
                 <w:szCs w:val="16"/>
               </w:rPr>
-              <w:t xml:space="preserve">4</w:t>
+              <w:t xml:space="preserve">7</w:t>
             </w:r>
           </w:p>
         </w:tc>
@@ -5762,7 +5762,7 @@
                 <w:sz w:val="16"/>
                 <w:szCs w:val="16"/>
               </w:rPr>
-              <w:t xml:space="preserve">3</w:t>
+              <w:t xml:space="preserve">5</w:t>
             </w:r>
           </w:p>
         </w:tc>
@@ -5797,7 +5797,7 @@
                 <w:sz w:val="16"/>
                 <w:szCs w:val="16"/>
               </w:rPr>
-              <w:t xml:space="preserve">3</w:t>
+              <w:t xml:space="preserve">5</w:t>
             </w:r>
           </w:p>
         </w:tc>
@@ -5835,7 +5835,7 @@
                 <w:sz w:val="16"/>
                 <w:szCs w:val="16"/>
               </w:rPr>
-              <w:t xml:space="preserve">Barrières réglementaires et sécurité (5 = faibles)</w:t>
+              <w:t xml:space="preserve">Barrières réglementaires et sécurité (10 = faibles)</w:t>
             </w:r>
           </w:p>
         </w:tc>
@@ -5905,7 +5905,7 @@
                 <w:sz w:val="16"/>
                 <w:szCs w:val="16"/>
               </w:rPr>
-              <w:t xml:space="preserve">4</w:t>
+              <w:t xml:space="preserve">8</w:t>
             </w:r>
           </w:p>
         </w:tc>
@@ -5940,7 +5940,7 @@
                 <w:sz w:val="16"/>
                 <w:szCs w:val="16"/>
               </w:rPr>
-              <w:t xml:space="preserve">3</w:t>
+              <w:t xml:space="preserve">6</w:t>
             </w:r>
           </w:p>
         </w:tc>
@@ -5975,7 +5975,7 @@
                 <w:sz w:val="16"/>
                 <w:szCs w:val="16"/>
               </w:rPr>
-              <w:t xml:space="preserve">2</w:t>
+              <w:t xml:space="preserve">3</w:t>
             </w:r>
           </w:p>
         </w:tc>
@@ -6010,7 +6010,7 @@
                 <w:sz w:val="16"/>
                 <w:szCs w:val="16"/>
               </w:rPr>
-              <w:t xml:space="preserve">2</w:t>
+              <w:t xml:space="preserve">3</w:t>
             </w:r>
           </w:p>
         </w:tc>
@@ -6048,7 +6048,7 @@
                 <w:sz w:val="16"/>
                 <w:szCs w:val="16"/>
               </w:rPr>
-              <w:t xml:space="preserve">Note d'attractivité / 5</w:t>
+              <w:t xml:space="preserve">Note d'attractivité / 10</w:t>
             </w:r>
           </w:p>
         </w:tc>
@@ -6118,7 +6118,7 @@
                 <w:sz w:val="16"/>
                 <w:szCs w:val="16"/>
               </w:rPr>
-              <w:t xml:space="preserve">3,10</w:t>
+              <w:t xml:space="preserve">5,95</w:t>
             </w:r>
           </w:p>
         </w:tc>
@@ -6153,7 +6153,7 @@
                 <w:sz w:val="16"/>
                 <w:szCs w:val="16"/>
               </w:rPr>
-              <w:t xml:space="preserve">4,05</w:t>
+              <w:t xml:space="preserve">7,30</w:t>
             </w:r>
           </w:p>
         </w:tc>
@@ -6188,7 +6188,7 @@
                 <w:sz w:val="16"/>
                 <w:szCs w:val="16"/>
               </w:rPr>
-              <w:t xml:space="preserve">3,05</w:t>
+              <w:t xml:space="preserve">4,85</w:t>
             </w:r>
           </w:p>
         </w:tc>
@@ -6223,7 +6223,7 @@
                 <w:sz w:val="16"/>
                 <w:szCs w:val="16"/>
               </w:rPr>
-              <w:t xml:space="preserve">3,55</w:t>
+              <w:t xml:space="preserve">5,85</w:t>
             </w:r>
           </w:p>
         </w:tc>
@@ -6489,7 +6489,7 @@
                 <w:sz w:val="16"/>
                 <w:szCs w:val="16"/>
               </w:rPr>
-              <w:t xml:space="preserve">5</w:t>
+              <w:t xml:space="preserve">9</w:t>
             </w:r>
           </w:p>
         </w:tc>
@@ -6524,7 +6524,7 @@
                 <w:sz w:val="16"/>
                 <w:szCs w:val="16"/>
               </w:rPr>
-              <w:t xml:space="preserve">4</w:t>
+              <w:t xml:space="preserve">7</w:t>
             </w:r>
           </w:p>
         </w:tc>
@@ -6559,7 +6559,7 @@
                 <w:sz w:val="16"/>
                 <w:szCs w:val="16"/>
               </w:rPr>
-              <w:t xml:space="preserve">2</w:t>
+              <w:t xml:space="preserve">3</w:t>
             </w:r>
           </w:p>
         </w:tc>
@@ -6594,7 +6594,7 @@
                 <w:sz w:val="16"/>
                 <w:szCs w:val="16"/>
               </w:rPr>
-              <w:t xml:space="preserve">2</w:t>
+              <w:t xml:space="preserve">3</w:t>
             </w:r>
           </w:p>
         </w:tc>
@@ -6702,7 +6702,7 @@
                 <w:sz w:val="16"/>
                 <w:szCs w:val="16"/>
               </w:rPr>
-              <w:t xml:space="preserve">4</w:t>
+              <w:t xml:space="preserve">8</w:t>
             </w:r>
           </w:p>
         </w:tc>
@@ -6737,7 +6737,7 @@
                 <w:sz w:val="16"/>
                 <w:szCs w:val="16"/>
               </w:rPr>
-              <w:t xml:space="preserve">4</w:t>
+              <w:t xml:space="preserve">8</w:t>
             </w:r>
           </w:p>
         </w:tc>
@@ -6772,7 +6772,7 @@
                 <w:sz w:val="16"/>
                 <w:szCs w:val="16"/>
               </w:rPr>
-              <w:t xml:space="preserve">2</w:t>
+              <w:t xml:space="preserve">3</w:t>
             </w:r>
           </w:p>
         </w:tc>
@@ -6807,7 +6807,7 @@
                 <w:sz w:val="16"/>
                 <w:szCs w:val="16"/>
               </w:rPr>
-              <w:t xml:space="preserve">1</w:t>
+              <w:t xml:space="preserve">2</w:t>
             </w:r>
           </w:p>
         </w:tc>
@@ -6915,7 +6915,7 @@
                 <w:sz w:val="16"/>
                 <w:szCs w:val="16"/>
               </w:rPr>
-              <w:t xml:space="preserve">4</w:t>
+              <w:t xml:space="preserve">7</w:t>
             </w:r>
           </w:p>
         </w:tc>
@@ -6950,7 +6950,7 @@
                 <w:sz w:val="16"/>
                 <w:szCs w:val="16"/>
               </w:rPr>
-              <w:t xml:space="preserve">2</w:t>
+              <w:t xml:space="preserve">3</w:t>
             </w:r>
           </w:p>
         </w:tc>
@@ -6985,7 +6985,7 @@
                 <w:sz w:val="16"/>
                 <w:szCs w:val="16"/>
               </w:rPr>
-              <w:t xml:space="preserve">1</w:t>
+              <w:t xml:space="preserve">2</w:t>
             </w:r>
           </w:p>
         </w:tc>
@@ -7128,7 +7128,7 @@
                 <w:sz w:val="16"/>
                 <w:szCs w:val="16"/>
               </w:rPr>
-              <w:t xml:space="preserve">3</w:t>
+              <w:t xml:space="preserve">6</w:t>
             </w:r>
           </w:p>
         </w:tc>
@@ -7163,7 +7163,7 @@
                 <w:sz w:val="16"/>
                 <w:szCs w:val="16"/>
               </w:rPr>
-              <w:t xml:space="preserve">4</w:t>
+              <w:t xml:space="preserve">6</w:t>
             </w:r>
           </w:p>
         </w:tc>
@@ -7198,7 +7198,7 @@
                 <w:sz w:val="16"/>
                 <w:szCs w:val="16"/>
               </w:rPr>
-              <w:t xml:space="preserve">2</w:t>
+              <w:t xml:space="preserve">4</w:t>
             </w:r>
           </w:p>
         </w:tc>
@@ -7233,7 +7233,7 @@
                 <w:sz w:val="16"/>
                 <w:szCs w:val="16"/>
               </w:rPr>
-              <w:t xml:space="preserve">2</w:t>
+              <w:t xml:space="preserve">4</w:t>
             </w:r>
           </w:p>
         </w:tc>
@@ -7271,7 +7271,7 @@
                 <w:sz w:val="16"/>
                 <w:szCs w:val="16"/>
               </w:rPr>
-              <w:t xml:space="preserve">Note d'atouts / 5</w:t>
+              <w:t xml:space="preserve">Note d'atouts / 10</w:t>
             </w:r>
           </w:p>
         </w:tc>
@@ -7341,7 +7341,7 @@
                 <w:sz w:val="16"/>
                 <w:szCs w:val="16"/>
               </w:rPr>
-              <w:t xml:space="preserve">4,10</w:t>
+              <w:t xml:space="preserve">7,70</w:t>
             </w:r>
           </w:p>
         </w:tc>
@@ -7376,7 +7376,7 @@
                 <w:sz w:val="16"/>
                 <w:szCs w:val="16"/>
               </w:rPr>
-              <w:t xml:space="preserve">3,60</w:t>
+              <w:t xml:space="preserve">6,30</w:t>
             </w:r>
           </w:p>
         </w:tc>
@@ -7411,7 +7411,7 @@
                 <w:sz w:val="16"/>
                 <w:szCs w:val="16"/>
               </w:rPr>
-              <w:t xml:space="preserve">1,80</w:t>
+              <w:t xml:space="preserve">3,00</w:t>
             </w:r>
           </w:p>
         </w:tc>
@@ -7446,7 +7446,7 @@
                 <w:sz w:val="16"/>
                 <w:szCs w:val="16"/>
               </w:rPr>
-              <w:t xml:space="preserve">1,70</w:t>
+              <w:t xml:space="preserve">2,70</w:t>
             </w:r>
           </w:p>
         </w:tc>
@@ -7471,7 +7471,7 @@
           <w:sz w:val="17"/>
           <w:szCs w:val="17"/>
         </w:rPr>
-        <w:t xml:space="preserve">Note = somme des (note × poids). Lecture : 1 à 2,3 faible ; 2,3 à 3,7 moyenne ; 3,7 à 5 forte. Notes estimées à partir des données de marché citées et de mon diagnostic interne.</w:t>
+        <w:t xml:space="preserve">Note = somme des (note × poids). Lecture : 0 à 3,3 faible ; 3,3 à 6,7 moyenne ; 6,7 à 10 forte. Notes estimées à partir des données de marché citées et de mon diagnostic interne.</w:t>
       </w:r>
     </w:p>
     <w:p>

</xml_diff>

<commit_message>
Livrable : captures de la page gamme luna du site (figures 6 et 7)
Co-Authored-By: Claude Opus 5.5 <noreply@anthropic.com>
Claude-Session: https://claude.ai/code/session_01GhVoXRgaJJbfXgbund27Nd
</commit_message>
<xml_diff>
--- a/livrables/Livrable_Marketing_Strategique_sip_lab_luna.docx
+++ b/livrables/Livrable_Marketing_Strategique_sip_lab_luna.docx
@@ -15881,6 +15881,188 @@
     </w:p>
     <w:p>
       <w:pPr>
+        <w:pStyle w:val="Heading2"/>
+        <w:spacing w:after="100" w:before="240"/>
+      </w:pPr>
+      <w:r>
+        <w:rPr>
+          <w:rFonts w:ascii="Cambria" w:cs="Cambria" w:eastAsia="Cambria" w:hAnsi="Cambria"/>
+          <w:color w:val="C8475A"/>
+          <w:sz w:val="25"/>
+          <w:szCs w:val="25"/>
+        </w:rPr>
+        <w:t xml:space="preserve">La page gamme luna du site</w:t>
+      </w:r>
+    </w:p>
+    <w:p>
+      <w:pPr>
+        <w:spacing w:after="120" w:line="288"/>
+        <w:jc w:val="both"/>
+      </w:pPr>
+      <w:r>
+        <w:rPr>
+          <w:rFonts w:ascii="Calibri" w:cs="Calibri" w:eastAsia="Calibri" w:hAnsi="Calibri"/>
+          <w:color w:val="2A1A20"/>
+          <w:sz w:val="21"/>
+          <w:szCs w:val="21"/>
+        </w:rPr>
+        <w:t xml:space="preserve">La page luna du site sip lab sert de support au MVP : c'est sur elle qu'arrivent les visiteuses envoyées par les créatrices, et c'est elle qui transforme l'intérêt en précommande. Elle traduit directement la proposition de valeur : la promesse « ton cycle, à chaque gorgée », la roue du cycle qui associe chaque phase à sa paille, les quatre références avec leur composition affichée et les formules de prix, dont la box cycle à 26 € mise en avant.</w:t>
+      </w:r>
+    </w:p>
+    <w:p>
+      <w:pPr>
+        <w:spacing w:before="120"/>
+        <w:jc w:val="center"/>
+      </w:pPr>
+      <w:r>
+        <w:drawing>
+          <wp:inline distT="0" distB="0" distL="0" distR="0">
+            <wp:extent cx="5334000" cy="4076700"/>
+            <wp:effectExtent t="0" r="0" b="0" l="0"/>
+            <wp:docPr id="1" name="fig7_site_hero.png" descr="Figure 6 : Page gamme luna du site sip lab, haut de page (maquette)" title="Figure 6 : Page gamme luna du site sip lab, haut de page (maquette)"/>
+            <wp:cNvGraphicFramePr>
+              <a:graphicFrameLocks xmlns:a="http://schemas.openxmlformats.org/drawingml/2006/main" noChangeAspect="1"/>
+            </wp:cNvGraphicFramePr>
+            <a:graphic xmlns:a="http://schemas.openxmlformats.org/drawingml/2006/main">
+              <a:graphicData uri="http://schemas.openxmlformats.org/drawingml/2006/picture">
+                <pic:pic xmlns:pic="http://schemas.openxmlformats.org/drawingml/2006/picture">
+                  <pic:nvPicPr>
+                    <pic:cNvPr id="0" name="" descr=""/>
+                    <pic:cNvPicPr>
+                      <a:picLocks noChangeAspect="1" noChangeArrowheads="1"/>
+                    </pic:cNvPicPr>
+                  </pic:nvPicPr>
+                  <pic:blipFill>
+                    <a:blip r:embed="rId15" cstate="none"/>
+                    <a:srcRect/>
+                    <a:stretch>
+                      <a:fillRect/>
+                    </a:stretch>
+                  </pic:blipFill>
+                  <pic:spPr bwMode="auto">
+                    <a:xfrm>
+                      <a:off x="0" y="0"/>
+                      <a:ext cx="5334000" cy="4076700"/>
+                    </a:xfrm>
+                    <a:prstGeom prst="rect">
+                      <a:avLst/>
+                    </a:prstGeom>
+                  </pic:spPr>
+                </pic:pic>
+              </a:graphicData>
+            </a:graphic>
+          </wp:inline>
+        </w:drawing>
+      </w:r>
+    </w:p>
+    <w:p>
+      <w:pPr>
+        <w:spacing w:after="200" w:before="60"/>
+        <w:jc w:val="center"/>
+      </w:pPr>
+      <w:r>
+        <w:rPr>
+          <w:rFonts w:ascii="Calibri" w:cs="Calibri" w:eastAsia="Calibri" w:hAnsi="Calibri"/>
+          <w:i/>
+          <w:iCs/>
+          <w:color w:val="6E5F65"/>
+          <w:sz w:val="17"/>
+          <w:szCs w:val="17"/>
+        </w:rPr>
+        <w:t xml:space="preserve">Figure 6 : Page gamme luna du site sip lab, haut de page (maquette)</w:t>
+      </w:r>
+    </w:p>
+    <w:p>
+      <w:pPr>
+        <w:spacing w:before="120"/>
+        <w:jc w:val="center"/>
+      </w:pPr>
+      <w:r>
+        <w:drawing>
+          <wp:inline distT="0" distB="0" distL="0" distR="0">
+            <wp:extent cx="5715000" cy="3905250"/>
+            <wp:effectExtent t="0" r="0" b="0" l="0"/>
+            <wp:docPr id="1" name="fig8_site_sections.png" descr="Figure 7 : Page luna : roue du cycle, les 4 pailles, fiche produit et formules (maquette)" title="Figure 7 : Page luna : roue du cycle, les 4 pailles, fiche produit et formules (maquette)"/>
+            <wp:cNvGraphicFramePr>
+              <a:graphicFrameLocks xmlns:a="http://schemas.openxmlformats.org/drawingml/2006/main" noChangeAspect="1"/>
+            </wp:cNvGraphicFramePr>
+            <a:graphic xmlns:a="http://schemas.openxmlformats.org/drawingml/2006/main">
+              <a:graphicData uri="http://schemas.openxmlformats.org/drawingml/2006/picture">
+                <pic:pic xmlns:pic="http://schemas.openxmlformats.org/drawingml/2006/picture">
+                  <pic:nvPicPr>
+                    <pic:cNvPr id="0" name="" descr=""/>
+                    <pic:cNvPicPr>
+                      <a:picLocks noChangeAspect="1" noChangeArrowheads="1"/>
+                    </pic:cNvPicPr>
+                  </pic:nvPicPr>
+                  <pic:blipFill>
+                    <a:blip r:embed="rId16" cstate="none"/>
+                    <a:srcRect/>
+                    <a:stretch>
+                      <a:fillRect/>
+                    </a:stretch>
+                  </pic:blipFill>
+                  <pic:spPr bwMode="auto">
+                    <a:xfrm>
+                      <a:off x="0" y="0"/>
+                      <a:ext cx="5715000" cy="3905250"/>
+                    </a:xfrm>
+                    <a:prstGeom prst="rect">
+                      <a:avLst/>
+                    </a:prstGeom>
+                  </pic:spPr>
+                </pic:pic>
+              </a:graphicData>
+            </a:graphic>
+          </wp:inline>
+        </w:drawing>
+      </w:r>
+    </w:p>
+    <w:p>
+      <w:pPr>
+        <w:spacing w:after="200" w:before="60"/>
+        <w:jc w:val="center"/>
+      </w:pPr>
+      <w:r>
+        <w:rPr>
+          <w:rFonts w:ascii="Calibri" w:cs="Calibri" w:eastAsia="Calibri" w:hAnsi="Calibri"/>
+          <w:i/>
+          <w:iCs/>
+          <w:color w:val="6E5F65"/>
+          <w:sz w:val="17"/>
+          <w:szCs w:val="17"/>
+        </w:rPr>
+        <w:t xml:space="preserve">Figure 7 : Page luna : roue du cycle, les 4 pailles, fiche produit et formules (maquette)</w:t>
+      </w:r>
+    </w:p>
+    <w:p>
+      <w:pPr>
+        <w:spacing w:after="120" w:line="288"/>
+        <w:jc w:val="both"/>
+      </w:pPr>
+      <w:r>
+        <w:rPr>
+          <w:rFonts w:ascii="Calibri" w:cs="Calibri" w:eastAsia="Calibri" w:hAnsi="Calibri"/>
+          <w:b/>
+          <w:bCs/>
+          <w:color w:val="2A1A20"/>
+          <w:sz w:val="21"/>
+          <w:szCs w:val="21"/>
+        </w:rPr>
+        <w:t xml:space="preserve">Ce que la page permet de mesurer</w:t>
+      </w:r>
+      <w:r>
+        <w:rPr>
+          <w:rFonts w:ascii="Calibri" w:cs="Calibri" w:eastAsia="Calibri" w:hAnsi="Calibri"/>
+          <w:color w:val="2A1A20"/>
+          <w:sz w:val="21"/>
+          <w:szCs w:val="21"/>
+        </w:rPr>
+        <w:t xml:space="preserve"> : le taux de clic depuis les contenus des créatrices, la conversion visite → précommande (H1), et grâce à deux versions de la page, l'effet de la caution sage-femme (H4). Prix, avis et compositions sont illustratifs à ce stade.</w:t>
+      </w:r>
+    </w:p>
+    <w:p>
+      <w:pPr>
         <w:pageBreakBefore/>
         <w:spacing w:after="60"/>
       </w:pPr>
@@ -17023,7 +17205,7 @@
           <wp:inline distT="0" distB="0" distL="0" distR="0">
             <wp:extent cx="4476750" cy="2162175"/>
             <wp:effectExtent t="0" r="0" b="0" l="0"/>
-            <wp:docPr id="1" name="fig6_entonnoir.png" descr="Figure 6 : Entonnoir de test et objectifs de conversion" title="Figure 6 : Entonnoir de test et objectifs de conversion"/>
+            <wp:docPr id="1" name="fig6_entonnoir.png" descr="Figure 8 : Entonnoir de test et objectifs de conversion" title="Figure 8 : Entonnoir de test et objectifs de conversion"/>
             <wp:cNvGraphicFramePr>
               <a:graphicFrameLocks xmlns:a="http://schemas.openxmlformats.org/drawingml/2006/main" noChangeAspect="1"/>
             </wp:cNvGraphicFramePr>
@@ -17037,7 +17219,7 @@
                     </pic:cNvPicPr>
                   </pic:nvPicPr>
                   <pic:blipFill>
-                    <a:blip r:embed="rId15" cstate="none"/>
+                    <a:blip r:embed="rId17" cstate="none"/>
                     <a:srcRect/>
                     <a:stretch>
                       <a:fillRect/>
@@ -17073,7 +17255,7 @@
           <w:sz w:val="17"/>
           <w:szCs w:val="17"/>
         </w:rPr>
-        <w:t xml:space="preserve">Figure 6 : Entonnoir de test et objectifs de conversion</w:t>
+        <w:t xml:space="preserve">Figure 8 : Entonnoir de test et objectifs de conversion</w:t>
       </w:r>
     </w:p>
     <w:p>

</xml_diff>

<commit_message>
Livrable : encadré sur le rituel au cœur du concept
Co-Authored-By: Claude Opus 5.5 <noreply@anthropic.com>
Claude-Session: https://claude.ai/code/session_01GhVoXRgaJJbfXgbund27Nd
</commit_message>
<xml_diff>
--- a/livrables/Livrable_Marketing_Strategique_sip_lab_luna.docx
+++ b/livrables/Livrable_Marketing_Strategique_sip_lab_luna.docx
@@ -17851,6 +17851,171 @@
     <w:p>
       <w:pPr>
         <w:spacing w:after="80"/>
+      </w:pPr>
+    </w:p>
+    <w:tbl>
+      <w:tblPr>
+        <w:tblW w:type="dxa" w:w="9638"/>
+        <w:tblBorders>
+          <w:top w:val="single" w:color="auto" w:sz="4"/>
+          <w:left w:val="single" w:color="auto" w:sz="4"/>
+          <w:bottom w:val="single" w:color="auto" w:sz="4"/>
+          <w:right w:val="single" w:color="auto" w:sz="4"/>
+          <w:insideH w:val="single" w:color="auto" w:sz="4"/>
+          <w:insideV w:val="single" w:color="auto" w:sz="4"/>
+        </w:tblBorders>
+      </w:tblPr>
+      <w:tblGrid>
+        <w:gridCol w:w="9638"/>
+      </w:tblGrid>
+      <w:tr>
+        <w:tc>
+          <w:tcPr>
+            <w:tcW w:type="dxa" w:w="9638"/>
+            <w:tcBorders>
+              <w:top w:val="none" w:color="FFFFFF" w:sz="0"/>
+              <w:left w:val="single" w:color="C8475A" w:sz="24"/>
+              <w:bottom w:val="none" w:color="FFFFFF" w:sz="0"/>
+              <w:right w:val="none" w:color="FFFFFF" w:sz="0"/>
+            </w:tcBorders>
+            <w:shd w:fill="FBEFF1" w:color="auto" w:val="clear"/>
+            <w:tcMar>
+              <w:top w:type="dxa" w:w="140"/>
+              <w:left w:type="dxa" w:w="220"/>
+              <w:bottom w:type="dxa" w:w="140"/>
+              <w:right w:type="dxa" w:w="220"/>
+            </w:tcMar>
+          </w:tcPr>
+          <w:p>
+            <w:pPr>
+              <w:spacing w:after="80"/>
+            </w:pPr>
+            <w:r>
+              <w:rPr>
+                <w:rFonts w:ascii="Calibri" w:cs="Calibri" w:eastAsia="Calibri" w:hAnsi="Calibri"/>
+                <w:b/>
+                <w:bCs/>
+                <w:color w:val="C8475A"/>
+                <w:sz w:val="20"/>
+                <w:szCs w:val="20"/>
+              </w:rPr>
+              <w:t xml:space="preserve">Au cœur du concept : un rituel, pas seulement un complément</w:t>
+            </w:r>
+          </w:p>
+          <w:p>
+            <w:pPr>
+              <w:spacing w:after="70" w:line="280"/>
+            </w:pPr>
+            <w:r>
+              <w:rPr>
+                <w:rFonts w:ascii="Calibri" w:cs="Calibri" w:eastAsia="Calibri" w:hAnsi="Calibri"/>
+                <w:color w:val="2A1A20"/>
+                <w:sz w:val="20"/>
+                <w:szCs w:val="20"/>
+              </w:rPr>
+              <w:t xml:space="preserve">Des gélules et des gummies pour le cycle existent déjà : l'actif seul ne suffit pas à se différencier. Ce que sip lab apporte en plus, c'est un </w:t>
+            </w:r>
+            <w:r>
+              <w:rPr>
+                <w:rFonts w:ascii="Calibri" w:cs="Calibri" w:eastAsia="Calibri" w:hAnsi="Calibri"/>
+                <w:b/>
+                <w:bCs/>
+                <w:color w:val="2A1A20"/>
+                <w:sz w:val="20"/>
+                <w:szCs w:val="20"/>
+              </w:rPr>
+              <w:t xml:space="preserve">rituel</w:t>
+            </w:r>
+            <w:r>
+              <w:rPr>
+                <w:rFonts w:ascii="Calibri" w:cs="Calibri" w:eastAsia="Calibri" w:hAnsi="Calibri"/>
+                <w:color w:val="2A1A20"/>
+                <w:sz w:val="20"/>
+                <w:szCs w:val="20"/>
+              </w:rPr>
+              <w:t xml:space="preserve"> : un geste simple et agréable, une paille datée qui correspond au jour du cycle, un petit moment à soi plutôt qu'une pilule de plus. L'objectif est de donner </w:t>
+            </w:r>
+            <w:r>
+              <w:rPr>
+                <w:rFonts w:ascii="Calibri" w:cs="Calibri" w:eastAsia="Calibri" w:hAnsi="Calibri"/>
+                <w:b/>
+                <w:bCs/>
+                <w:color w:val="2A1A20"/>
+                <w:sz w:val="20"/>
+                <w:szCs w:val="20"/>
+              </w:rPr>
+              <w:t xml:space="preserve">envie</w:t>
+            </w:r>
+            <w:r>
+              <w:rPr>
+                <w:rFonts w:ascii="Calibri" w:cs="Calibri" w:eastAsia="Calibri" w:hAnsi="Calibri"/>
+                <w:color w:val="2A1A20"/>
+                <w:sz w:val="20"/>
+                <w:szCs w:val="20"/>
+              </w:rPr>
+              <w:t xml:space="preserve"> de prendre sa paille : le goût, le packaging, la roue du cycle et l'univers luna en font une habitude que l'on attend, pas une contrainte.</w:t>
+            </w:r>
+          </w:p>
+          <w:p>
+            <w:pPr>
+              <w:spacing w:after="70" w:line="280"/>
+            </w:pPr>
+            <w:r>
+              <w:rPr>
+                <w:rFonts w:ascii="Calibri" w:cs="Calibri" w:eastAsia="Calibri" w:hAnsi="Calibri"/>
+                <w:color w:val="2A1A20"/>
+                <w:sz w:val="20"/>
+                <w:szCs w:val="20"/>
+              </w:rPr>
+              <w:t xml:space="preserve">Ce rituel est aussi un levier stratégique : il soutient la </w:t>
+            </w:r>
+            <w:r>
+              <w:rPr>
+                <w:rFonts w:ascii="Calibri" w:cs="Calibri" w:eastAsia="Calibri" w:hAnsi="Calibri"/>
+                <w:b/>
+                <w:bCs/>
+                <w:color w:val="2A1A20"/>
+                <w:sz w:val="20"/>
+                <w:szCs w:val="20"/>
+              </w:rPr>
+              <w:t xml:space="preserve">régularité</w:t>
+            </w:r>
+            <w:r>
+              <w:rPr>
+                <w:rFonts w:ascii="Calibri" w:cs="Calibri" w:eastAsia="Calibri" w:hAnsi="Calibri"/>
+                <w:color w:val="2A1A20"/>
+                <w:sz w:val="20"/>
+                <w:szCs w:val="20"/>
+              </w:rPr>
+              <w:t xml:space="preserve"> (H2) et le </w:t>
+            </w:r>
+            <w:r>
+              <w:rPr>
+                <w:rFonts w:ascii="Calibri" w:cs="Calibri" w:eastAsia="Calibri" w:hAnsi="Calibri"/>
+                <w:b/>
+                <w:bCs/>
+                <w:color w:val="2A1A20"/>
+                <w:sz w:val="20"/>
+                <w:szCs w:val="20"/>
+              </w:rPr>
+              <w:t xml:space="preserve">réachat</w:t>
+            </w:r>
+            <w:r>
+              <w:rPr>
+                <w:rFonts w:ascii="Calibri" w:cs="Calibri" w:eastAsia="Calibri" w:hAnsi="Calibri"/>
+                <w:color w:val="2A1A20"/>
+                <w:sz w:val="20"/>
+                <w:szCs w:val="20"/>
+              </w:rPr>
+              <w:t xml:space="preserve"> (H3), et il est bien plus difficile à copier qu'une formule, car il repose sur la marque, l'expérience et la communauté (#mysiplabroutine).</w:t>
+            </w:r>
+          </w:p>
+        </w:tc>
+      </w:tr>
+    </w:tbl>
+    <w:p>
+      <w:pPr>
+        <w:spacing w:after="120"/>
       </w:pPr>
     </w:p>
     <w:tbl>

</xml_diff>